<commit_message>
tp-shacl: agrega shapes.ttl, grafos de datos valido/invalido y reportes pyshacl
- shapes.ttl: 7 NodeShape, 16 sh:property, jerarquia House->RealEstate
- data-valid.ttl: cumple todas las restricciones (Conforms: True)
- data-invalid.ttl: viola 8 restricciones disenadas (Conforms: False, 9 violaciones)
- reports/: salidas de pyshacl para ambos casos
- seguimiento.docx: documenta etapas 2 y 3
</commit_message>
<xml_diff>
--- a/tp-shacl/seguimiento.docx
+++ b/tp-shacl/seguimiento.docx
@@ -10175,6 +10175,2780 @@
     <w:p>
       <w:r>
         <w:t xml:space="preserve">Próximo paso: redactar shapes.ttl usando los nombres reales en inglés (House, Apartment, Price, Address, PostalAddress, etc.) y reflejar la jerarquía RealEstate → House con sh:node.</w:t>
+      </w:r>
+    </w:p>
+    <w:p>
+      <w:r>
+        <w:t xml:space="preserve"/>
+      </w:r>
+    </w:p>
+    <w:p>
+      <w:pPr>
+        <w:pStyle w:val="Heading2"/>
+      </w:pPr>
+      <w:r>
+        <w:t xml:space="preserve">Etapa 2 — Redacción de shapes.ttl</w:t>
+      </w:r>
+    </w:p>
+    <w:p>
+      <w:pPr>
+        <w:pStyle w:val="Heading3"/>
+      </w:pPr>
+      <w:r>
+        <w:t xml:space="preserve">Archivo generado</w:t>
+      </w:r>
+    </w:p>
+    <w:p>
+      <w:r>
+        <w:t xml:space="preserve">Ruta: tp-shacl/shapes.ttl</w:t>
+      </w:r>
+    </w:p>
+    <w:p>
+      <w:r>
+        <w:t xml:space="preserve">Estado: parsea correctamente (128 tripletas). Verificado con rdflib.</w:t>
+      </w:r>
+    </w:p>
+    <w:p>
+      <w:r>
+        <w:t xml:space="preserve"/>
+      </w:r>
+    </w:p>
+    <w:p>
+      <w:pPr>
+        <w:pStyle w:val="Heading3"/>
+      </w:pPr>
+      <w:r>
+        <w:t xml:space="preserve">NodeShapes incluidas (7 en total — requisito mínimo: 5)</w:t>
+      </w:r>
+    </w:p>
+    <w:tbl>
+      <w:tblPr>
+        <w:tblW w:type="dxa" w:w="9360"/>
+        <w:tblBorders>
+          <w:top w:val="single" w:color="auto" w:sz="4"/>
+          <w:left w:val="single" w:color="auto" w:sz="4"/>
+          <w:bottom w:val="single" w:color="auto" w:sz="4"/>
+          <w:right w:val="single" w:color="auto" w:sz="4"/>
+          <w:insideH w:val="single" w:color="auto" w:sz="4"/>
+          <w:insideV w:val="single" w:color="auto" w:sz="4"/>
+        </w:tblBorders>
+      </w:tblPr>
+      <w:tblGrid>
+        <w:gridCol w:w="500"/>
+        <w:gridCol w:w="2500"/>
+        <w:gridCol w:w="2360"/>
+        <w:gridCol w:w="4000"/>
+      </w:tblGrid>
+      <w:tr>
+        <w:tc>
+          <w:tcPr>
+            <w:tcW w:type="dxa" w:w="500"/>
+            <w:tcBorders>
+              <w:top w:val="single" w:color="CCCCCC" w:sz="1"/>
+              <w:left w:val="single" w:color="CCCCCC" w:sz="1"/>
+              <w:bottom w:val="single" w:color="CCCCCC" w:sz="1"/>
+              <w:right w:val="single" w:color="CCCCCC" w:sz="1"/>
+            </w:tcBorders>
+            <w:shd w:fill="D5E8F0" w:val="clear"/>
+            <w:tcMar>
+              <w:top w:type="dxa" w:w="80"/>
+              <w:left w:type="dxa" w:w="120"/>
+              <w:bottom w:type="dxa" w:w="80"/>
+              <w:right w:type="dxa" w:w="120"/>
+            </w:tcMar>
+          </w:tcPr>
+          <w:p>
+            <w:r>
+              <w:rPr>
+                <w:b/>
+                <w:bCs/>
+              </w:rPr>
+              <w:t xml:space="preserve">#</w:t>
+            </w:r>
+          </w:p>
+        </w:tc>
+        <w:tc>
+          <w:tcPr>
+            <w:tcW w:type="dxa" w:w="2500"/>
+            <w:tcBorders>
+              <w:top w:val="single" w:color="CCCCCC" w:sz="1"/>
+              <w:left w:val="single" w:color="CCCCCC" w:sz="1"/>
+              <w:bottom w:val="single" w:color="CCCCCC" w:sz="1"/>
+              <w:right w:val="single" w:color="CCCCCC" w:sz="1"/>
+            </w:tcBorders>
+            <w:shd w:fill="D5E8F0" w:val="clear"/>
+            <w:tcMar>
+              <w:top w:type="dxa" w:w="80"/>
+              <w:left w:type="dxa" w:w="120"/>
+              <w:bottom w:type="dxa" w:w="80"/>
+              <w:right w:type="dxa" w:w="120"/>
+            </w:tcMar>
+          </w:tcPr>
+          <w:p>
+            <w:r>
+              <w:rPr>
+                <w:b/>
+                <w:bCs/>
+              </w:rPr>
+              <w:t xml:space="preserve">Shape</w:t>
+            </w:r>
+          </w:p>
+        </w:tc>
+        <w:tc>
+          <w:tcPr>
+            <w:tcW w:type="dxa" w:w="2360"/>
+            <w:tcBorders>
+              <w:top w:val="single" w:color="CCCCCC" w:sz="1"/>
+              <w:left w:val="single" w:color="CCCCCC" w:sz="1"/>
+              <w:bottom w:val="single" w:color="CCCCCC" w:sz="1"/>
+              <w:right w:val="single" w:color="CCCCCC" w:sz="1"/>
+            </w:tcBorders>
+            <w:shd w:fill="D5E8F0" w:val="clear"/>
+            <w:tcMar>
+              <w:top w:type="dxa" w:w="80"/>
+              <w:left w:type="dxa" w:w="120"/>
+              <w:bottom w:type="dxa" w:w="80"/>
+              <w:right w:type="dxa" w:w="120"/>
+            </w:tcMar>
+          </w:tcPr>
+          <w:p>
+            <w:r>
+              <w:rPr>
+                <w:b/>
+                <w:bCs/>
+              </w:rPr>
+              <w:t xml:space="preserve">targetClass</w:t>
+            </w:r>
+          </w:p>
+        </w:tc>
+        <w:tc>
+          <w:tcPr>
+            <w:tcW w:type="dxa" w:w="4000"/>
+            <w:tcBorders>
+              <w:top w:val="single" w:color="CCCCCC" w:sz="1"/>
+              <w:left w:val="single" w:color="CCCCCC" w:sz="1"/>
+              <w:bottom w:val="single" w:color="CCCCCC" w:sz="1"/>
+              <w:right w:val="single" w:color="CCCCCC" w:sz="1"/>
+            </w:tcBorders>
+            <w:shd w:fill="D5E8F0" w:val="clear"/>
+            <w:tcMar>
+              <w:top w:type="dxa" w:w="80"/>
+              <w:left w:type="dxa" w:w="120"/>
+              <w:bottom w:type="dxa" w:w="80"/>
+              <w:right w:type="dxa" w:w="120"/>
+            </w:tcMar>
+          </w:tcPr>
+          <w:p>
+            <w:r>
+              <w:rPr>
+                <w:b/>
+                <w:bCs/>
+              </w:rPr>
+              <w:t xml:space="preserve">Restricciones principales</w:t>
+            </w:r>
+          </w:p>
+        </w:tc>
+      </w:tr>
+      <w:tr>
+        <w:tc>
+          <w:tcPr>
+            <w:tcW w:type="dxa" w:w="500"/>
+            <w:tcBorders>
+              <w:top w:val="single" w:color="CCCCCC" w:sz="1"/>
+              <w:left w:val="single" w:color="CCCCCC" w:sz="1"/>
+              <w:bottom w:val="single" w:color="CCCCCC" w:sz="1"/>
+              <w:right w:val="single" w:color="CCCCCC" w:sz="1"/>
+            </w:tcBorders>
+            <w:tcMar>
+              <w:top w:type="dxa" w:w="60"/>
+              <w:left w:type="dxa" w:w="120"/>
+              <w:bottom w:type="dxa" w:w="60"/>
+              <w:right w:type="dxa" w:w="120"/>
+            </w:tcMar>
+          </w:tcPr>
+          <w:p>
+            <w:r>
+              <w:rPr>
+                <w:sz w:val="20"/>
+                <w:szCs w:val="20"/>
+              </w:rPr>
+              <w:t xml:space="preserve">1</w:t>
+            </w:r>
+          </w:p>
+        </w:tc>
+        <w:tc>
+          <w:tcPr>
+            <w:tcW w:type="dxa" w:w="2500"/>
+            <w:tcBorders>
+              <w:top w:val="single" w:color="CCCCCC" w:sz="1"/>
+              <w:left w:val="single" w:color="CCCCCC" w:sz="1"/>
+              <w:bottom w:val="single" w:color="CCCCCC" w:sz="1"/>
+              <w:right w:val="single" w:color="CCCCCC" w:sz="1"/>
+            </w:tcBorders>
+            <w:tcMar>
+              <w:top w:type="dxa" w:w="60"/>
+              <w:left w:type="dxa" w:w="120"/>
+              <w:bottom w:type="dxa" w:w="60"/>
+              <w:right w:type="dxa" w:w="120"/>
+            </w:tcMar>
+          </w:tcPr>
+          <w:p>
+            <w:r>
+              <w:rPr>
+                <w:rFonts w:ascii="Courier New" w:cs="Courier New" w:eastAsia="Courier New" w:hAnsi="Courier New"/>
+                <w:sz w:val="20"/>
+                <w:szCs w:val="20"/>
+              </w:rPr>
+              <w:t xml:space="preserve">:RealEstateShape</w:t>
+            </w:r>
+          </w:p>
+        </w:tc>
+        <w:tc>
+          <w:tcPr>
+            <w:tcW w:type="dxa" w:w="2360"/>
+            <w:tcBorders>
+              <w:top w:val="single" w:color="CCCCCC" w:sz="1"/>
+              <w:left w:val="single" w:color="CCCCCC" w:sz="1"/>
+              <w:bottom w:val="single" w:color="CCCCCC" w:sz="1"/>
+              <w:right w:val="single" w:color="CCCCCC" w:sz="1"/>
+            </w:tcBorders>
+            <w:tcMar>
+              <w:top w:type="dxa" w:w="60"/>
+              <w:left w:type="dxa" w:w="120"/>
+              <w:bottom w:type="dxa" w:w="60"/>
+              <w:right w:type="dxa" w:w="120"/>
+            </w:tcMar>
+          </w:tcPr>
+          <w:p>
+            <w:r>
+              <w:rPr>
+                <w:rFonts w:ascii="Courier New" w:cs="Courier New" w:eastAsia="Courier New" w:hAnsi="Courier New"/>
+                <w:sz w:val="20"/>
+                <w:szCs w:val="20"/>
+              </w:rPr>
+              <w:t xml:space="preserve">rec:RealEstate</w:t>
+            </w:r>
+          </w:p>
+        </w:tc>
+        <w:tc>
+          <w:tcPr>
+            <w:tcW w:type="dxa" w:w="4000"/>
+            <w:tcBorders>
+              <w:top w:val="single" w:color="CCCCCC" w:sz="1"/>
+              <w:left w:val="single" w:color="CCCCCC" w:sz="1"/>
+              <w:bottom w:val="single" w:color="CCCCCC" w:sz="1"/>
+              <w:right w:val="single" w:color="CCCCCC" w:sz="1"/>
+            </w:tcBorders>
+            <w:tcMar>
+              <w:top w:type="dxa" w:w="60"/>
+              <w:left w:type="dxa" w:w="120"/>
+              <w:bottom w:type="dxa" w:w="60"/>
+              <w:right w:type="dxa" w:w="120"/>
+            </w:tcMar>
+          </w:tcPr>
+          <w:p>
+            <w:r>
+              <w:rPr>
+                <w:sz w:val="20"/>
+                <w:szCs w:val="20"/>
+              </w:rPr>
+              <w:t xml:space="preserve">Shape padre. Todo inmueble debe tener ≥1 io:Feature y ≥1 rec:Architecture.</w:t>
+            </w:r>
+          </w:p>
+        </w:tc>
+      </w:tr>
+      <w:tr>
+        <w:tc>
+          <w:tcPr>
+            <w:tcW w:type="dxa" w:w="500"/>
+            <w:tcBorders>
+              <w:top w:val="single" w:color="CCCCCC" w:sz="1"/>
+              <w:left w:val="single" w:color="CCCCCC" w:sz="1"/>
+              <w:bottom w:val="single" w:color="CCCCCC" w:sz="1"/>
+              <w:right w:val="single" w:color="CCCCCC" w:sz="1"/>
+            </w:tcBorders>
+            <w:tcMar>
+              <w:top w:type="dxa" w:w="60"/>
+              <w:left w:type="dxa" w:w="120"/>
+              <w:bottom w:type="dxa" w:w="60"/>
+              <w:right w:type="dxa" w:w="120"/>
+            </w:tcMar>
+          </w:tcPr>
+          <w:p>
+            <w:r>
+              <w:rPr>
+                <w:sz w:val="20"/>
+                <w:szCs w:val="20"/>
+              </w:rPr>
+              <w:t xml:space="preserve">2</w:t>
+            </w:r>
+          </w:p>
+        </w:tc>
+        <w:tc>
+          <w:tcPr>
+            <w:tcW w:type="dxa" w:w="2500"/>
+            <w:tcBorders>
+              <w:top w:val="single" w:color="CCCCCC" w:sz="1"/>
+              <w:left w:val="single" w:color="CCCCCC" w:sz="1"/>
+              <w:bottom w:val="single" w:color="CCCCCC" w:sz="1"/>
+              <w:right w:val="single" w:color="CCCCCC" w:sz="1"/>
+            </w:tcBorders>
+            <w:tcMar>
+              <w:top w:type="dxa" w:w="60"/>
+              <w:left w:type="dxa" w:w="120"/>
+              <w:bottom w:type="dxa" w:w="60"/>
+              <w:right w:type="dxa" w:w="120"/>
+            </w:tcMar>
+          </w:tcPr>
+          <w:p>
+            <w:r>
+              <w:rPr>
+                <w:rFonts w:ascii="Courier New" w:cs="Courier New" w:eastAsia="Courier New" w:hAnsi="Courier New"/>
+                <w:sz w:val="20"/>
+                <w:szCs w:val="20"/>
+              </w:rPr>
+              <w:t xml:space="preserve">:HouseShape</w:t>
+            </w:r>
+          </w:p>
+        </w:tc>
+        <w:tc>
+          <w:tcPr>
+            <w:tcW w:type="dxa" w:w="2360"/>
+            <w:tcBorders>
+              <w:top w:val="single" w:color="CCCCCC" w:sz="1"/>
+              <w:left w:val="single" w:color="CCCCCC" w:sz="1"/>
+              <w:bottom w:val="single" w:color="CCCCCC" w:sz="1"/>
+              <w:right w:val="single" w:color="CCCCCC" w:sz="1"/>
+            </w:tcBorders>
+            <w:tcMar>
+              <w:top w:type="dxa" w:w="60"/>
+              <w:left w:type="dxa" w:w="120"/>
+              <w:bottom w:type="dxa" w:w="60"/>
+              <w:right w:type="dxa" w:w="120"/>
+            </w:tcMar>
+          </w:tcPr>
+          <w:p>
+            <w:r>
+              <w:rPr>
+                <w:rFonts w:ascii="Courier New" w:cs="Courier New" w:eastAsia="Courier New" w:hAnsi="Courier New"/>
+                <w:sz w:val="20"/>
+                <w:szCs w:val="20"/>
+              </w:rPr>
+              <w:t xml:space="preserve">io:House</w:t>
+            </w:r>
+          </w:p>
+        </w:tc>
+        <w:tc>
+          <w:tcPr>
+            <w:tcW w:type="dxa" w:w="4000"/>
+            <w:tcBorders>
+              <w:top w:val="single" w:color="CCCCCC" w:sz="1"/>
+              <w:left w:val="single" w:color="CCCCCC" w:sz="1"/>
+              <w:bottom w:val="single" w:color="CCCCCC" w:sz="1"/>
+              <w:right w:val="single" w:color="CCCCCC" w:sz="1"/>
+            </w:tcBorders>
+            <w:tcMar>
+              <w:top w:type="dxa" w:w="60"/>
+              <w:left w:type="dxa" w:w="120"/>
+              <w:bottom w:type="dxa" w:w="60"/>
+              <w:right w:type="dxa" w:w="120"/>
+            </w:tcMar>
+          </w:tcPr>
+          <w:p>
+            <w:r>
+              <w:rPr>
+                <w:sz w:val="20"/>
+                <w:szCs w:val="20"/>
+              </w:rPr>
+              <w:t xml:space="preserve">Shape HIJA: hereda de RealEstateShape vía sh:node + exige io:RoomAmnt (cumple jerarquía).</w:t>
+            </w:r>
+          </w:p>
+        </w:tc>
+      </w:tr>
+      <w:tr>
+        <w:tc>
+          <w:tcPr>
+            <w:tcW w:type="dxa" w:w="500"/>
+            <w:tcBorders>
+              <w:top w:val="single" w:color="CCCCCC" w:sz="1"/>
+              <w:left w:val="single" w:color="CCCCCC" w:sz="1"/>
+              <w:bottom w:val="single" w:color="CCCCCC" w:sz="1"/>
+              <w:right w:val="single" w:color="CCCCCC" w:sz="1"/>
+            </w:tcBorders>
+            <w:tcMar>
+              <w:top w:type="dxa" w:w="60"/>
+              <w:left w:type="dxa" w:w="120"/>
+              <w:bottom w:type="dxa" w:w="60"/>
+              <w:right w:type="dxa" w:w="120"/>
+            </w:tcMar>
+          </w:tcPr>
+          <w:p>
+            <w:r>
+              <w:rPr>
+                <w:sz w:val="20"/>
+                <w:szCs w:val="20"/>
+              </w:rPr>
+              <w:t xml:space="preserve">3</w:t>
+            </w:r>
+          </w:p>
+        </w:tc>
+        <w:tc>
+          <w:tcPr>
+            <w:tcW w:type="dxa" w:w="2500"/>
+            <w:tcBorders>
+              <w:top w:val="single" w:color="CCCCCC" w:sz="1"/>
+              <w:left w:val="single" w:color="CCCCCC" w:sz="1"/>
+              <w:bottom w:val="single" w:color="CCCCCC" w:sz="1"/>
+              <w:right w:val="single" w:color="CCCCCC" w:sz="1"/>
+            </w:tcBorders>
+            <w:tcMar>
+              <w:top w:type="dxa" w:w="60"/>
+              <w:left w:type="dxa" w:w="120"/>
+              <w:bottom w:type="dxa" w:w="60"/>
+              <w:right w:type="dxa" w:w="120"/>
+            </w:tcMar>
+          </w:tcPr>
+          <w:p>
+            <w:r>
+              <w:rPr>
+                <w:rFonts w:ascii="Courier New" w:cs="Courier New" w:eastAsia="Courier New" w:hAnsi="Courier New"/>
+                <w:sz w:val="20"/>
+                <w:szCs w:val="20"/>
+              </w:rPr>
+              <w:t xml:space="preserve">:RealEstateListingShape</w:t>
+            </w:r>
+          </w:p>
+        </w:tc>
+        <w:tc>
+          <w:tcPr>
+            <w:tcW w:type="dxa" w:w="2360"/>
+            <w:tcBorders>
+              <w:top w:val="single" w:color="CCCCCC" w:sz="1"/>
+              <w:left w:val="single" w:color="CCCCCC" w:sz="1"/>
+              <w:bottom w:val="single" w:color="CCCCCC" w:sz="1"/>
+              <w:right w:val="single" w:color="CCCCCC" w:sz="1"/>
+            </w:tcBorders>
+            <w:tcMar>
+              <w:top w:type="dxa" w:w="60"/>
+              <w:left w:type="dxa" w:w="120"/>
+              <w:bottom w:type="dxa" w:w="60"/>
+              <w:right w:type="dxa" w:w="120"/>
+            </w:tcMar>
+          </w:tcPr>
+          <w:p>
+            <w:r>
+              <w:rPr>
+                <w:rFonts w:ascii="Courier New" w:cs="Courier New" w:eastAsia="Courier New" w:hAnsi="Courier New"/>
+                <w:sz w:val="20"/>
+                <w:szCs w:val="20"/>
+              </w:rPr>
+              <w:t xml:space="preserve">pronto:RealEstateListing</w:t>
+            </w:r>
+          </w:p>
+        </w:tc>
+        <w:tc>
+          <w:tcPr>
+            <w:tcW w:type="dxa" w:w="4000"/>
+            <w:tcBorders>
+              <w:top w:val="single" w:color="CCCCCC" w:sz="1"/>
+              <w:left w:val="single" w:color="CCCCCC" w:sz="1"/>
+              <w:bottom w:val="single" w:color="CCCCCC" w:sz="1"/>
+              <w:right w:val="single" w:color="CCCCCC" w:sz="1"/>
+            </w:tcBorders>
+            <w:tcMar>
+              <w:top w:type="dxa" w:w="60"/>
+              <w:left w:type="dxa" w:w="120"/>
+              <w:bottom w:type="dxa" w:w="60"/>
+              <w:right w:type="dxa" w:w="120"/>
+            </w:tcMar>
+          </w:tcPr>
+          <w:p>
+            <w:r>
+              <w:rPr>
+                <w:sz w:val="20"/>
+                <w:szCs w:val="20"/>
+              </w:rPr>
+              <w:t xml:space="preserve">Aviso: sioc:about (1..1 rec:RealEstate), sioc:has_creator, gr:hasBusinessFunction ∈ {Sell, LeaseOut}, sioc:id, ≥1 feature.</w:t>
+            </w:r>
+          </w:p>
+        </w:tc>
+      </w:tr>
+      <w:tr>
+        <w:tc>
+          <w:tcPr>
+            <w:tcW w:type="dxa" w:w="500"/>
+            <w:tcBorders>
+              <w:top w:val="single" w:color="CCCCCC" w:sz="1"/>
+              <w:left w:val="single" w:color="CCCCCC" w:sz="1"/>
+              <w:bottom w:val="single" w:color="CCCCCC" w:sz="1"/>
+              <w:right w:val="single" w:color="CCCCCC" w:sz="1"/>
+            </w:tcBorders>
+            <w:tcMar>
+              <w:top w:type="dxa" w:w="60"/>
+              <w:left w:type="dxa" w:w="120"/>
+              <w:bottom w:type="dxa" w:w="60"/>
+              <w:right w:type="dxa" w:w="120"/>
+            </w:tcMar>
+          </w:tcPr>
+          <w:p>
+            <w:r>
+              <w:rPr>
+                <w:sz w:val="20"/>
+                <w:szCs w:val="20"/>
+              </w:rPr>
+              <w:t xml:space="preserve">4</w:t>
+            </w:r>
+          </w:p>
+        </w:tc>
+        <w:tc>
+          <w:tcPr>
+            <w:tcW w:type="dxa" w:w="2500"/>
+            <w:tcBorders>
+              <w:top w:val="single" w:color="CCCCCC" w:sz="1"/>
+              <w:left w:val="single" w:color="CCCCCC" w:sz="1"/>
+              <w:bottom w:val="single" w:color="CCCCCC" w:sz="1"/>
+              <w:right w:val="single" w:color="CCCCCC" w:sz="1"/>
+            </w:tcBorders>
+            <w:tcMar>
+              <w:top w:type="dxa" w:w="60"/>
+              <w:left w:type="dxa" w:w="120"/>
+              <w:bottom w:type="dxa" w:w="60"/>
+              <w:right w:type="dxa" w:w="120"/>
+            </w:tcMar>
+          </w:tcPr>
+          <w:p>
+            <w:r>
+              <w:rPr>
+                <w:rFonts w:ascii="Courier New" w:cs="Courier New" w:eastAsia="Courier New" w:hAnsi="Courier New"/>
+                <w:sz w:val="20"/>
+                <w:szCs w:val="20"/>
+              </w:rPr>
+              <w:t xml:space="preserve">:PriceShape</w:t>
+            </w:r>
+          </w:p>
+        </w:tc>
+        <w:tc>
+          <w:tcPr>
+            <w:tcW w:type="dxa" w:w="2360"/>
+            <w:tcBorders>
+              <w:top w:val="single" w:color="CCCCCC" w:sz="1"/>
+              <w:left w:val="single" w:color="CCCCCC" w:sz="1"/>
+              <w:bottom w:val="single" w:color="CCCCCC" w:sz="1"/>
+              <w:right w:val="single" w:color="CCCCCC" w:sz="1"/>
+            </w:tcBorders>
+            <w:tcMar>
+              <w:top w:type="dxa" w:w="60"/>
+              <w:left w:type="dxa" w:w="120"/>
+              <w:bottom w:type="dxa" w:w="60"/>
+              <w:right w:type="dxa" w:w="120"/>
+            </w:tcMar>
+          </w:tcPr>
+          <w:p>
+            <w:r>
+              <w:rPr>
+                <w:rFonts w:ascii="Courier New" w:cs="Courier New" w:eastAsia="Courier New" w:hAnsi="Courier New"/>
+                <w:sz w:val="20"/>
+                <w:szCs w:val="20"/>
+              </w:rPr>
+              <w:t xml:space="preserve">io:Price</w:t>
+            </w:r>
+          </w:p>
+        </w:tc>
+        <w:tc>
+          <w:tcPr>
+            <w:tcW w:type="dxa" w:w="4000"/>
+            <w:tcBorders>
+              <w:top w:val="single" w:color="CCCCCC" w:sz="1"/>
+              <w:left w:val="single" w:color="CCCCCC" w:sz="1"/>
+              <w:bottom w:val="single" w:color="CCCCCC" w:sz="1"/>
+              <w:right w:val="single" w:color="CCCCCC" w:sz="1"/>
+            </w:tcBorders>
+            <w:tcMar>
+              <w:top w:type="dxa" w:w="60"/>
+              <w:left w:type="dxa" w:w="120"/>
+              <w:bottom w:type="dxa" w:w="60"/>
+              <w:right w:type="dxa" w:w="120"/>
+            </w:tcMar>
+          </w:tcPr>
+          <w:p>
+            <w:r>
+              <w:rPr>
+                <w:sz w:val="20"/>
+                <w:szCs w:val="20"/>
+              </w:rPr>
+              <w:t xml:space="preserve">Todo io:Price debe tener al menos un io:hasDetail (TemporalFeature).</w:t>
+            </w:r>
+          </w:p>
+        </w:tc>
+      </w:tr>
+      <w:tr>
+        <w:tc>
+          <w:tcPr>
+            <w:tcW w:type="dxa" w:w="500"/>
+            <w:tcBorders>
+              <w:top w:val="single" w:color="CCCCCC" w:sz="1"/>
+              <w:left w:val="single" w:color="CCCCCC" w:sz="1"/>
+              <w:bottom w:val="single" w:color="CCCCCC" w:sz="1"/>
+              <w:right w:val="single" w:color="CCCCCC" w:sz="1"/>
+            </w:tcBorders>
+            <w:tcMar>
+              <w:top w:type="dxa" w:w="60"/>
+              <w:left w:type="dxa" w:w="120"/>
+              <w:bottom w:type="dxa" w:w="60"/>
+              <w:right w:type="dxa" w:w="120"/>
+            </w:tcMar>
+          </w:tcPr>
+          <w:p>
+            <w:r>
+              <w:rPr>
+                <w:sz w:val="20"/>
+                <w:szCs w:val="20"/>
+              </w:rPr>
+              <w:t xml:space="preserve">5</w:t>
+            </w:r>
+          </w:p>
+        </w:tc>
+        <w:tc>
+          <w:tcPr>
+            <w:tcW w:type="dxa" w:w="2500"/>
+            <w:tcBorders>
+              <w:top w:val="single" w:color="CCCCCC" w:sz="1"/>
+              <w:left w:val="single" w:color="CCCCCC" w:sz="1"/>
+              <w:bottom w:val="single" w:color="CCCCCC" w:sz="1"/>
+              <w:right w:val="single" w:color="CCCCCC" w:sz="1"/>
+            </w:tcBorders>
+            <w:tcMar>
+              <w:top w:type="dxa" w:w="60"/>
+              <w:left w:type="dxa" w:w="120"/>
+              <w:bottom w:type="dxa" w:w="60"/>
+              <w:right w:type="dxa" w:w="120"/>
+            </w:tcMar>
+          </w:tcPr>
+          <w:p>
+            <w:r>
+              <w:rPr>
+                <w:rFonts w:ascii="Courier New" w:cs="Courier New" w:eastAsia="Courier New" w:hAnsi="Courier New"/>
+                <w:sz w:val="20"/>
+                <w:szCs w:val="20"/>
+              </w:rPr>
+              <w:t xml:space="preserve">:UnitPriceSpecificationShape</w:t>
+            </w:r>
+          </w:p>
+        </w:tc>
+        <w:tc>
+          <w:tcPr>
+            <w:tcW w:type="dxa" w:w="2360"/>
+            <w:tcBorders>
+              <w:top w:val="single" w:color="CCCCCC" w:sz="1"/>
+              <w:left w:val="single" w:color="CCCCCC" w:sz="1"/>
+              <w:bottom w:val="single" w:color="CCCCCC" w:sz="1"/>
+              <w:right w:val="single" w:color="CCCCCC" w:sz="1"/>
+            </w:tcBorders>
+            <w:tcMar>
+              <w:top w:type="dxa" w:w="60"/>
+              <w:left w:type="dxa" w:w="120"/>
+              <w:bottom w:type="dxa" w:w="60"/>
+              <w:right w:type="dxa" w:w="120"/>
+            </w:tcMar>
+          </w:tcPr>
+          <w:p>
+            <w:r>
+              <w:rPr>
+                <w:rFonts w:ascii="Courier New" w:cs="Courier New" w:eastAsia="Courier New" w:hAnsi="Courier New"/>
+                <w:sz w:val="20"/>
+                <w:szCs w:val="20"/>
+              </w:rPr>
+              <w:t xml:space="preserve">gr:UnitPriceSpecification</w:t>
+            </w:r>
+          </w:p>
+        </w:tc>
+        <w:tc>
+          <w:tcPr>
+            <w:tcW w:type="dxa" w:w="4000"/>
+            <w:tcBorders>
+              <w:top w:val="single" w:color="CCCCCC" w:sz="1"/>
+              <w:left w:val="single" w:color="CCCCCC" w:sz="1"/>
+              <w:bottom w:val="single" w:color="CCCCCC" w:sz="1"/>
+              <w:right w:val="single" w:color="CCCCCC" w:sz="1"/>
+            </w:tcBorders>
+            <w:tcMar>
+              <w:top w:type="dxa" w:w="60"/>
+              <w:left w:type="dxa" w:w="120"/>
+              <w:bottom w:type="dxa" w:w="60"/>
+              <w:right w:type="dxa" w:w="120"/>
+            </w:tcMar>
+          </w:tcPr>
+          <w:p>
+            <w:r>
+              <w:rPr>
+                <w:sz w:val="20"/>
+                <w:szCs w:val="20"/>
+              </w:rPr>
+              <w:t xml:space="preserve">Moneda ISO 4217 (regex), monto float &gt; 0, priceType ∈ {BASE, TOTAL}.</w:t>
+            </w:r>
+          </w:p>
+        </w:tc>
+      </w:tr>
+      <w:tr>
+        <w:tc>
+          <w:tcPr>
+            <w:tcW w:type="dxa" w:w="500"/>
+            <w:tcBorders>
+              <w:top w:val="single" w:color="CCCCCC" w:sz="1"/>
+              <w:left w:val="single" w:color="CCCCCC" w:sz="1"/>
+              <w:bottom w:val="single" w:color="CCCCCC" w:sz="1"/>
+              <w:right w:val="single" w:color="CCCCCC" w:sz="1"/>
+            </w:tcBorders>
+            <w:tcMar>
+              <w:top w:type="dxa" w:w="60"/>
+              <w:left w:type="dxa" w:w="120"/>
+              <w:bottom w:type="dxa" w:w="60"/>
+              <w:right w:type="dxa" w:w="120"/>
+            </w:tcMar>
+          </w:tcPr>
+          <w:p>
+            <w:r>
+              <w:rPr>
+                <w:sz w:val="20"/>
+                <w:szCs w:val="20"/>
+              </w:rPr>
+              <w:t xml:space="preserve">6</w:t>
+            </w:r>
+          </w:p>
+        </w:tc>
+        <w:tc>
+          <w:tcPr>
+            <w:tcW w:type="dxa" w:w="2500"/>
+            <w:tcBorders>
+              <w:top w:val="single" w:color="CCCCCC" w:sz="1"/>
+              <w:left w:val="single" w:color="CCCCCC" w:sz="1"/>
+              <w:bottom w:val="single" w:color="CCCCCC" w:sz="1"/>
+              <w:right w:val="single" w:color="CCCCCC" w:sz="1"/>
+            </w:tcBorders>
+            <w:tcMar>
+              <w:top w:type="dxa" w:w="60"/>
+              <w:left w:type="dxa" w:w="120"/>
+              <w:bottom w:type="dxa" w:w="60"/>
+              <w:right w:type="dxa" w:w="120"/>
+            </w:tcMar>
+          </w:tcPr>
+          <w:p>
+            <w:r>
+              <w:rPr>
+                <w:rFonts w:ascii="Courier New" w:cs="Courier New" w:eastAsia="Courier New" w:hAnsi="Courier New"/>
+                <w:sz w:val="20"/>
+                <w:szCs w:val="20"/>
+              </w:rPr>
+              <w:t xml:space="preserve">:PostalAddressShape</w:t>
+            </w:r>
+          </w:p>
+        </w:tc>
+        <w:tc>
+          <w:tcPr>
+            <w:tcW w:type="dxa" w:w="2360"/>
+            <w:tcBorders>
+              <w:top w:val="single" w:color="CCCCCC" w:sz="1"/>
+              <w:left w:val="single" w:color="CCCCCC" w:sz="1"/>
+              <w:bottom w:val="single" w:color="CCCCCC" w:sz="1"/>
+              <w:right w:val="single" w:color="CCCCCC" w:sz="1"/>
+            </w:tcBorders>
+            <w:tcMar>
+              <w:top w:type="dxa" w:w="60"/>
+              <w:left w:type="dxa" w:w="120"/>
+              <w:bottom w:type="dxa" w:w="60"/>
+              <w:right w:type="dxa" w:w="120"/>
+            </w:tcMar>
+          </w:tcPr>
+          <w:p>
+            <w:r>
+              <w:rPr>
+                <w:rFonts w:ascii="Courier New" w:cs="Courier New" w:eastAsia="Courier New" w:hAnsi="Courier New"/>
+                <w:sz w:val="20"/>
+                <w:szCs w:val="20"/>
+              </w:rPr>
+              <w:t xml:space="preserve">io:PostalAddress</w:t>
+            </w:r>
+          </w:p>
+        </w:tc>
+        <w:tc>
+          <w:tcPr>
+            <w:tcW w:type="dxa" w:w="4000"/>
+            <w:tcBorders>
+              <w:top w:val="single" w:color="CCCCCC" w:sz="1"/>
+              <w:left w:val="single" w:color="CCCCCC" w:sz="1"/>
+              <w:bottom w:val="single" w:color="CCCCCC" w:sz="1"/>
+              <w:right w:val="single" w:color="CCCCCC" w:sz="1"/>
+            </w:tcBorders>
+            <w:tcMar>
+              <w:top w:type="dxa" w:w="60"/>
+              <w:left w:type="dxa" w:w="120"/>
+              <w:bottom w:type="dxa" w:w="60"/>
+              <w:right w:type="dxa" w:w="120"/>
+            </w:tcMar>
+          </w:tcPr>
+          <w:p>
+            <w:r>
+              <w:rPr>
+                <w:sz w:val="20"/>
+                <w:szCs w:val="20"/>
+              </w:rPr>
+              <w:t xml:space="preserve">io:address no vacío, rec:city y io:province obligatorias, io:neighborhood opcional pero tipada.</w:t>
+            </w:r>
+          </w:p>
+        </w:tc>
+      </w:tr>
+      <w:tr>
+        <w:tc>
+          <w:tcPr>
+            <w:tcW w:type="dxa" w:w="500"/>
+            <w:tcBorders>
+              <w:top w:val="single" w:color="CCCCCC" w:sz="1"/>
+              <w:left w:val="single" w:color="CCCCCC" w:sz="1"/>
+              <w:bottom w:val="single" w:color="CCCCCC" w:sz="1"/>
+              <w:right w:val="single" w:color="CCCCCC" w:sz="1"/>
+            </w:tcBorders>
+            <w:tcMar>
+              <w:top w:type="dxa" w:w="60"/>
+              <w:left w:type="dxa" w:w="120"/>
+              <w:bottom w:type="dxa" w:w="60"/>
+              <w:right w:type="dxa" w:w="120"/>
+            </w:tcMar>
+          </w:tcPr>
+          <w:p>
+            <w:r>
+              <w:rPr>
+                <w:sz w:val="20"/>
+                <w:szCs w:val="20"/>
+              </w:rPr>
+              <w:t xml:space="preserve">7</w:t>
+            </w:r>
+          </w:p>
+        </w:tc>
+        <w:tc>
+          <w:tcPr>
+            <w:tcW w:type="dxa" w:w="2500"/>
+            <w:tcBorders>
+              <w:top w:val="single" w:color="CCCCCC" w:sz="1"/>
+              <w:left w:val="single" w:color="CCCCCC" w:sz="1"/>
+              <w:bottom w:val="single" w:color="CCCCCC" w:sz="1"/>
+              <w:right w:val="single" w:color="CCCCCC" w:sz="1"/>
+            </w:tcBorders>
+            <w:tcMar>
+              <w:top w:type="dxa" w:w="60"/>
+              <w:left w:type="dxa" w:w="120"/>
+              <w:bottom w:type="dxa" w:w="60"/>
+              <w:right w:type="dxa" w:w="120"/>
+            </w:tcMar>
+          </w:tcPr>
+          <w:p>
+            <w:r>
+              <w:rPr>
+                <w:rFonts w:ascii="Courier New" w:cs="Courier New" w:eastAsia="Courier New" w:hAnsi="Courier New"/>
+                <w:sz w:val="20"/>
+                <w:szCs w:val="20"/>
+              </w:rPr>
+              <w:t xml:space="preserve">:OriginShape</w:t>
+            </w:r>
+          </w:p>
+        </w:tc>
+        <w:tc>
+          <w:tcPr>
+            <w:tcW w:type="dxa" w:w="2360"/>
+            <w:tcBorders>
+              <w:top w:val="single" w:color="CCCCCC" w:sz="1"/>
+              <w:left w:val="single" w:color="CCCCCC" w:sz="1"/>
+              <w:bottom w:val="single" w:color="CCCCCC" w:sz="1"/>
+              <w:right w:val="single" w:color="CCCCCC" w:sz="1"/>
+            </w:tcBorders>
+            <w:tcMar>
+              <w:top w:type="dxa" w:w="60"/>
+              <w:left w:type="dxa" w:w="120"/>
+              <w:bottom w:type="dxa" w:w="60"/>
+              <w:right w:type="dxa" w:w="120"/>
+            </w:tcMar>
+          </w:tcPr>
+          <w:p>
+            <w:r>
+              <w:rPr>
+                <w:rFonts w:ascii="Courier New" w:cs="Courier New" w:eastAsia="Courier New" w:hAnsi="Courier New"/>
+                <w:sz w:val="20"/>
+                <w:szCs w:val="20"/>
+              </w:rPr>
+              <w:t xml:space="preserve">io:Origin</w:t>
+            </w:r>
+          </w:p>
+        </w:tc>
+        <w:tc>
+          <w:tcPr>
+            <w:tcW w:type="dxa" w:w="4000"/>
+            <w:tcBorders>
+              <w:top w:val="single" w:color="CCCCCC" w:sz="1"/>
+              <w:left w:val="single" w:color="CCCCCC" w:sz="1"/>
+              <w:bottom w:val="single" w:color="CCCCCC" w:sz="1"/>
+              <w:right w:val="single" w:color="CCCCCC" w:sz="1"/>
+            </w:tcBorders>
+            <w:tcMar>
+              <w:top w:type="dxa" w:w="60"/>
+              <w:left w:type="dxa" w:w="120"/>
+              <w:bottom w:type="dxa" w:w="60"/>
+              <w:right w:type="dxa" w:w="120"/>
+            </w:tcMar>
+          </w:tcPr>
+          <w:p>
+            <w:r>
+              <w:rPr>
+                <w:sz w:val="20"/>
+                <w:szCs w:val="20"/>
+              </w:rPr>
+              <w:t xml:space="preserve">Debe ser IRI nombrado y de tipo io:Scraper, io:AVE o io:Curation (sh:or).</w:t>
+            </w:r>
+          </w:p>
+        </w:tc>
+      </w:tr>
+    </w:tbl>
+    <w:p>
+      <w:r>
+        <w:t xml:space="preserve"/>
+      </w:r>
+    </w:p>
+    <w:p>
+      <w:pPr>
+        <w:pStyle w:val="Heading3"/>
+      </w:pPr>
+      <w:r>
+        <w:t xml:space="preserve">Conteo de restricciones</w:t>
+      </w:r>
+    </w:p>
+    <w:p>
+      <w:r>
+        <w:t xml:space="preserve">• Total sh:property declaradas: 16 (requisito mínimo: 15) ✅</w:t>
+      </w:r>
+    </w:p>
+    <w:p>
+      <w:r>
+        <w:t xml:space="preserve">• Constraints usadas (variedad): sh:minCount, sh:maxCount, sh:datatype, sh:class, sh:nodeKind, sh:pattern, sh:minExclusive, sh:minLength, sh:in, sh:or, sh:node, sh:qualifiedValueShape, sh:qualifiedMinCount, sh:message.</w:t>
+      </w:r>
+    </w:p>
+    <w:p>
+      <w:r>
+        <w:t xml:space="preserve">• Jerarquía: HouseShape sh:node :RealEstateShape — cumple el requisito 'analizar una jerarquía de clases' ✅</w:t>
+      </w:r>
+    </w:p>
+    <w:p>
+      <w:r>
+        <w:t xml:space="preserve"/>
+      </w:r>
+    </w:p>
+    <w:p>
+      <w:pPr>
+        <w:pStyle w:val="Heading3"/>
+      </w:pPr>
+      <w:r>
+        <w:t xml:space="preserve">Decisiones de diseño tomadas</w:t>
+      </w:r>
+    </w:p>
+    <w:p>
+      <w:r>
+        <w:t xml:space="preserve">• Prefijo de las shapes: : → http://example.org/shapes/inmontology# (namespace propio, no choca con OVS).</w:t>
+      </w:r>
+    </w:p>
+    <w:p>
+      <w:r>
+        <w:t xml:space="preserve">• Se NO restringió io:Feature como NodeShape directa porque cada subclase (Price, Address, Dimensions, etc.) tiene su propia lógica — se atacan individualmente (PriceShape) o vía la subclase de RealEstate (HouseShape exige io:RoomAmnt).</w:t>
+      </w:r>
+    </w:p>
+    <w:p>
+      <w:r>
+        <w:t xml:space="preserve">• El detalle temporal (io:TemporalFeature, io:hasScraperValue, io:hasScraperTime) queda implícito: PriceShape exige io:hasDetail pero no se restringe la estructura interna del detalle para no acoplarse a un origen específico (Scraper vs AVE vs Curation). Buen punto para trabajos futuros.</w:t>
+      </w:r>
+    </w:p>
+    <w:p>
+      <w:r>
+        <w:t xml:space="preserve">• OriginShape usa sh:or con sh:class para forzar que el origen sea una de las 3 subclases definidas (Scraper, AVE, Curation).</w:t>
+      </w:r>
+    </w:p>
+    <w:p>
+      <w:r>
+        <w:t xml:space="preserve"/>
+      </w:r>
+    </w:p>
+    <w:p>
+      <w:pPr>
+        <w:pStyle w:val="Heading3"/>
+      </w:pPr>
+      <w:r>
+        <w:t xml:space="preserve">Cosas que quedaron como TRABAJOS FUTUROS</w:t>
+      </w:r>
+    </w:p>
+    <w:p>
+      <w:r>
+        <w:t xml:space="preserve">• Coherencia superficie cubierta ≤ total (requiere sh:sparql, no constraints básicos).</w:t>
+      </w:r>
+    </w:p>
+    <w:p>
+      <w:r>
+        <w:t xml:space="preserve">• Validar que sioc:read_at sea posterior o igual a dc:date del listing.</w:t>
+      </w:r>
+    </w:p>
+    <w:p>
+      <w:r>
+        <w:t xml:space="preserve">• Coherencia origen-timestamp: si origen es AVE debe haber io:hasAVETime; si es Scraper debe haber io:hasScraperTime; si es Curation debe haber io:hasCurationTime.</w:t>
+      </w:r>
+    </w:p>
+    <w:p>
+      <w:r>
+        <w:t xml:space="preserve">• Validar que las coordenadas geográficas (rec:coordinates) caigan dentro del bounding box de la io:Province declarada.</w:t>
+      </w:r>
+    </w:p>
+    <w:p>
+      <w:r>
+        <w:t xml:space="preserve"/>
+      </w:r>
+    </w:p>
+    <w:p>
+      <w:pPr>
+        <w:pStyle w:val="Heading3"/>
+      </w:pPr>
+      <w:r>
+        <w:t xml:space="preserve">Verificación realizada</w:t>
+      </w:r>
+    </w:p>
+    <w:p>
+      <w:pPr>
+        <w:spacing w:after="0" w:before="0"/>
+      </w:pPr>
+      <w:r>
+        <w:rPr>
+          <w:rFonts w:ascii="Courier New" w:cs="Courier New" w:eastAsia="Courier New" w:hAnsi="Courier New"/>
+          <w:sz w:val="20"/>
+          <w:szCs w:val="20"/>
+        </w:rPr>
+        <w:t xml:space="preserve">$ python3 -c "import rdflib; g=rdflib.Graph(); g.parse('shapes.ttl'); print(len(g))"</w:t>
+      </w:r>
+    </w:p>
+    <w:p>
+      <w:pPr>
+        <w:spacing w:after="0" w:before="0"/>
+      </w:pPr>
+      <w:r>
+        <w:rPr>
+          <w:rFonts w:ascii="Courier New" w:cs="Courier New" w:eastAsia="Courier New" w:hAnsi="Courier New"/>
+          <w:sz w:val="20"/>
+          <w:szCs w:val="20"/>
+        </w:rPr>
+        <w:t xml:space="preserve">128</w:t>
+      </w:r>
+    </w:p>
+    <w:p>
+      <w:pPr>
+        <w:spacing w:after="0" w:before="0"/>
+      </w:pPr>
+      <w:r>
+        <w:rPr>
+          <w:rFonts w:ascii="Courier New" w:cs="Courier New" w:eastAsia="Courier New" w:hAnsi="Courier New"/>
+          <w:sz w:val="20"/>
+          <w:szCs w:val="20"/>
+        </w:rPr>
+        <w:t xml:space="preserve"> </w:t>
+      </w:r>
+    </w:p>
+    <w:p>
+      <w:pPr>
+        <w:spacing w:after="0" w:before="0"/>
+      </w:pPr>
+      <w:r>
+        <w:rPr>
+          <w:rFonts w:ascii="Courier New" w:cs="Courier New" w:eastAsia="Courier New" w:hAnsi="Courier New"/>
+          <w:sz w:val="20"/>
+          <w:szCs w:val="20"/>
+        </w:rPr>
+        <w:t xml:space="preserve">NodeShapes encontradas: 7</w:t>
+      </w:r>
+    </w:p>
+    <w:p>
+      <w:pPr>
+        <w:spacing w:after="0" w:before="0"/>
+      </w:pPr>
+      <w:r>
+        <w:rPr>
+          <w:rFonts w:ascii="Courier New" w:cs="Courier New" w:eastAsia="Courier New" w:hAnsi="Courier New"/>
+          <w:sz w:val="20"/>
+          <w:szCs w:val="20"/>
+        </w:rPr>
+        <w:t xml:space="preserve">  - :RealEstateShape</w:t>
+      </w:r>
+    </w:p>
+    <w:p>
+      <w:pPr>
+        <w:spacing w:after="0" w:before="0"/>
+      </w:pPr>
+      <w:r>
+        <w:rPr>
+          <w:rFonts w:ascii="Courier New" w:cs="Courier New" w:eastAsia="Courier New" w:hAnsi="Courier New"/>
+          <w:sz w:val="20"/>
+          <w:szCs w:val="20"/>
+        </w:rPr>
+        <w:t xml:space="preserve">  - :HouseShape</w:t>
+      </w:r>
+    </w:p>
+    <w:p>
+      <w:pPr>
+        <w:spacing w:after="0" w:before="0"/>
+      </w:pPr>
+      <w:r>
+        <w:rPr>
+          <w:rFonts w:ascii="Courier New" w:cs="Courier New" w:eastAsia="Courier New" w:hAnsi="Courier New"/>
+          <w:sz w:val="20"/>
+          <w:szCs w:val="20"/>
+        </w:rPr>
+        <w:t xml:space="preserve">  - :RealEstateListingShape</w:t>
+      </w:r>
+    </w:p>
+    <w:p>
+      <w:pPr>
+        <w:spacing w:after="0" w:before="0"/>
+      </w:pPr>
+      <w:r>
+        <w:rPr>
+          <w:rFonts w:ascii="Courier New" w:cs="Courier New" w:eastAsia="Courier New" w:hAnsi="Courier New"/>
+          <w:sz w:val="20"/>
+          <w:szCs w:val="20"/>
+        </w:rPr>
+        <w:t xml:space="preserve">  - :PriceShape</w:t>
+      </w:r>
+    </w:p>
+    <w:p>
+      <w:pPr>
+        <w:spacing w:after="0" w:before="0"/>
+      </w:pPr>
+      <w:r>
+        <w:rPr>
+          <w:rFonts w:ascii="Courier New" w:cs="Courier New" w:eastAsia="Courier New" w:hAnsi="Courier New"/>
+          <w:sz w:val="20"/>
+          <w:szCs w:val="20"/>
+        </w:rPr>
+        <w:t xml:space="preserve">  - :UnitPriceSpecificationShape</w:t>
+      </w:r>
+    </w:p>
+    <w:p>
+      <w:pPr>
+        <w:spacing w:after="0" w:before="0"/>
+      </w:pPr>
+      <w:r>
+        <w:rPr>
+          <w:rFonts w:ascii="Courier New" w:cs="Courier New" w:eastAsia="Courier New" w:hAnsi="Courier New"/>
+          <w:sz w:val="20"/>
+          <w:szCs w:val="20"/>
+        </w:rPr>
+        <w:t xml:space="preserve">  - :PostalAddressShape</w:t>
+      </w:r>
+    </w:p>
+    <w:p>
+      <w:pPr>
+        <w:spacing w:after="0" w:before="0"/>
+      </w:pPr>
+      <w:r>
+        <w:rPr>
+          <w:rFonts w:ascii="Courier New" w:cs="Courier New" w:eastAsia="Courier New" w:hAnsi="Courier New"/>
+          <w:sz w:val="20"/>
+          <w:szCs w:val="20"/>
+        </w:rPr>
+        <w:t xml:space="preserve">  - :OriginShape</w:t>
+      </w:r>
+    </w:p>
+    <w:p>
+      <w:pPr>
+        <w:spacing w:after="0" w:before="0"/>
+      </w:pPr>
+      <w:r>
+        <w:rPr>
+          <w:rFonts w:ascii="Courier New" w:cs="Courier New" w:eastAsia="Courier New" w:hAnsi="Courier New"/>
+          <w:sz w:val="20"/>
+          <w:szCs w:val="20"/>
+        </w:rPr>
+        <w:t xml:space="preserve"> </w:t>
+      </w:r>
+    </w:p>
+    <w:p>
+      <w:pPr>
+        <w:spacing w:after="0" w:before="0"/>
+      </w:pPr>
+      <w:r>
+        <w:rPr>
+          <w:rFonts w:ascii="Courier New" w:cs="Courier New" w:eastAsia="Courier New" w:hAnsi="Courier New"/>
+          <w:sz w:val="20"/>
+          <w:szCs w:val="20"/>
+        </w:rPr>
+        <w:t xml:space="preserve">sh:property declaradas: 16</w:t>
+      </w:r>
+    </w:p>
+    <w:p>
+      <w:r>
+        <w:t xml:space="preserve"/>
+      </w:r>
+    </w:p>
+    <w:p>
+      <w:pPr>
+        <w:pStyle w:val="Heading3"/>
+      </w:pPr>
+      <w:r>
+        <w:t xml:space="preserve">Ajuste aplicado durante la validación</w:t>
+      </w:r>
+    </w:p>
+    <w:p>
+      <w:r>
+        <w:t xml:space="preserve">En PriceShape la restricción sh:in para gr:priceType combinada con sh:datatype xsd:string generaba un falso positivo en pyshacl. Se reemplazó por:</w:t>
+      </w:r>
+    </w:p>
+    <w:p>
+      <w:pPr>
+        <w:spacing w:after="0" w:before="0"/>
+      </w:pPr>
+      <w:r>
+        <w:rPr>
+          <w:rFonts w:ascii="Courier New" w:cs="Courier New" w:eastAsia="Courier New" w:hAnsi="Courier New"/>
+          <w:sz w:val="20"/>
+          <w:szCs w:val="20"/>
+        </w:rPr>
+        <w:t xml:space="preserve">sh:in ( "BASE"^^xsd:string "TOTAL"^^xsd:string )</w:t>
+      </w:r>
+    </w:p>
+    <w:p>
+      <w:r>
+        <w:t xml:space="preserve">Funcionalmente equivalente, sin el quirk del motor.</w:t>
+      </w:r>
+    </w:p>
+    <w:p>
+      <w:r>
+        <w:t xml:space="preserve"/>
+      </w:r>
+    </w:p>
+    <w:p>
+      <w:pPr>
+        <w:pStyle w:val="Heading2"/>
+      </w:pPr>
+      <w:r>
+        <w:t xml:space="preserve">Etapa 3 — Datos de prueba y validación</w:t>
+      </w:r>
+    </w:p>
+    <w:p>
+      <w:pPr>
+        <w:pStyle w:val="Heading3"/>
+      </w:pPr>
+      <w:r>
+        <w:t xml:space="preserve">Archivos generados</w:t>
+      </w:r>
+    </w:p>
+    <w:p>
+      <w:r>
+        <w:t xml:space="preserve">• tp-shacl/data-valid.ttl — grafo que cumple todas las restricciones.</w:t>
+      </w:r>
+    </w:p>
+    <w:p>
+      <w:r>
+        <w:t xml:space="preserve">• tp-shacl/data-invalid.ttl — grafo que viola 8 restricciones distintas a propósito.</w:t>
+      </w:r>
+    </w:p>
+    <w:p>
+      <w:r>
+        <w:t xml:space="preserve">• tp-shacl/reports/valid-report.txt — reporte pyshacl del caso válido.</w:t>
+      </w:r>
+    </w:p>
+    <w:p>
+      <w:r>
+        <w:t xml:space="preserve">• tp-shacl/reports/invalid-report.txt — reporte pyshacl del caso inválido.</w:t>
+      </w:r>
+    </w:p>
+    <w:p>
+      <w:r>
+        <w:t xml:space="preserve"/>
+      </w:r>
+    </w:p>
+    <w:p>
+      <w:pPr>
+        <w:pStyle w:val="Heading3"/>
+      </w:pPr>
+      <w:r>
+        <w:t xml:space="preserve">Comando de validación usado</w:t>
+      </w:r>
+    </w:p>
+    <w:p>
+      <w:pPr>
+        <w:spacing w:after="0" w:before="0"/>
+      </w:pPr>
+      <w:r>
+        <w:rPr>
+          <w:rFonts w:ascii="Courier New" w:cs="Courier New" w:eastAsia="Courier New" w:hAnsi="Courier New"/>
+          <w:sz w:val="20"/>
+          <w:szCs w:val="20"/>
+        </w:rPr>
+        <w:t xml:space="preserve">python3 -m pyshacl -s tp-shacl/shapes.ttl \</w:t>
+      </w:r>
+    </w:p>
+    <w:p>
+      <w:pPr>
+        <w:spacing w:after="0" w:before="0"/>
+      </w:pPr>
+      <w:r>
+        <w:rPr>
+          <w:rFonts w:ascii="Courier New" w:cs="Courier New" w:eastAsia="Courier New" w:hAnsi="Courier New"/>
+          <w:sz w:val="20"/>
+          <w:szCs w:val="20"/>
+        </w:rPr>
+        <w:t xml:space="preserve">                  -d tp-shacl/data-valid.ttl \</w:t>
+      </w:r>
+    </w:p>
+    <w:p>
+      <w:pPr>
+        <w:spacing w:after="0" w:before="0"/>
+      </w:pPr>
+      <w:r>
+        <w:rPr>
+          <w:rFonts w:ascii="Courier New" w:cs="Courier New" w:eastAsia="Courier New" w:hAnsi="Courier New"/>
+          <w:sz w:val="20"/>
+          <w:szCs w:val="20"/>
+        </w:rPr>
+        <w:t xml:space="preserve">                  -e inmontology.owl \</w:t>
+      </w:r>
+    </w:p>
+    <w:p>
+      <w:pPr>
+        <w:spacing w:after="0" w:before="0"/>
+      </w:pPr>
+      <w:r>
+        <w:rPr>
+          <w:rFonts w:ascii="Courier New" w:cs="Courier New" w:eastAsia="Courier New" w:hAnsi="Courier New"/>
+          <w:sz w:val="20"/>
+          <w:szCs w:val="20"/>
+        </w:rPr>
+        <w:t xml:space="preserve">                  --inference rdfs \</w:t>
+      </w:r>
+    </w:p>
+    <w:p>
+      <w:pPr>
+        <w:spacing w:after="0" w:before="0"/>
+      </w:pPr>
+      <w:r>
+        <w:rPr>
+          <w:rFonts w:ascii="Courier New" w:cs="Courier New" w:eastAsia="Courier New" w:hAnsi="Courier New"/>
+          <w:sz w:val="20"/>
+          <w:szCs w:val="20"/>
+        </w:rPr>
+        <w:t xml:space="preserve">                  -f human</w:t>
+      </w:r>
+    </w:p>
+    <w:p>
+      <w:r>
+        <w:t xml:space="preserve"/>
+      </w:r>
+    </w:p>
+    <w:p>
+      <w:r>
+        <w:t xml:space="preserve">Notar el flag -e inmontology.owl: pyshacl necesita la ontología base para saber, por ejemplo, que io:Price es subclase de io:Feature. Sin eso falla por error de tipos. Con --inference rdfs aplica las inferencias rdfs:subClassOf automáticamente.</w:t>
+      </w:r>
+    </w:p>
+    <w:p>
+      <w:r>
+        <w:t xml:space="preserve"/>
+      </w:r>
+    </w:p>
+    <w:p>
+      <w:pPr>
+        <w:pStyle w:val="Heading3"/>
+      </w:pPr>
+      <w:r>
+        <w:t xml:space="preserve">Resultado del caso VÁLIDO</w:t>
+      </w:r>
+    </w:p>
+    <w:p>
+      <w:pPr>
+        <w:spacing w:after="0" w:before="0"/>
+      </w:pPr>
+      <w:r>
+        <w:rPr>
+          <w:rFonts w:ascii="Courier New" w:cs="Courier New" w:eastAsia="Courier New" w:hAnsi="Courier New"/>
+          <w:sz w:val="20"/>
+          <w:szCs w:val="20"/>
+        </w:rPr>
+        <w:t xml:space="preserve">Validation Report</w:t>
+      </w:r>
+    </w:p>
+    <w:p>
+      <w:pPr>
+        <w:spacing w:after="0" w:before="0"/>
+      </w:pPr>
+      <w:r>
+        <w:rPr>
+          <w:rFonts w:ascii="Courier New" w:cs="Courier New" w:eastAsia="Courier New" w:hAnsi="Courier New"/>
+          <w:sz w:val="20"/>
+          <w:szCs w:val="20"/>
+        </w:rPr>
+        <w:t xml:space="preserve">Conforms: True</w:t>
+      </w:r>
+    </w:p>
+    <w:p>
+      <w:r>
+        <w:t xml:space="preserve">→ El grafo data-valid.ttl pasa las 16 restricciones definidas en shapes.ttl.</w:t>
+      </w:r>
+    </w:p>
+    <w:p>
+      <w:r>
+        <w:t xml:space="preserve"/>
+      </w:r>
+    </w:p>
+    <w:p>
+      <w:pPr>
+        <w:pStyle w:val="Heading3"/>
+      </w:pPr>
+      <w:r>
+        <w:t xml:space="preserve">Resultado del caso INVÁLIDO (8 violaciones diseñadas)</w:t>
+      </w:r>
+    </w:p>
+    <w:p>
+      <w:pPr>
+        <w:spacing w:after="0" w:before="0"/>
+      </w:pPr>
+      <w:r>
+        <w:rPr>
+          <w:rFonts w:ascii="Courier New" w:cs="Courier New" w:eastAsia="Courier New" w:hAnsi="Courier New"/>
+          <w:sz w:val="20"/>
+          <w:szCs w:val="20"/>
+        </w:rPr>
+        <w:t xml:space="preserve">Validation Report</w:t>
+      </w:r>
+    </w:p>
+    <w:p>
+      <w:pPr>
+        <w:spacing w:after="0" w:before="0"/>
+      </w:pPr>
+      <w:r>
+        <w:rPr>
+          <w:rFonts w:ascii="Courier New" w:cs="Courier New" w:eastAsia="Courier New" w:hAnsi="Courier New"/>
+          <w:sz w:val="20"/>
+          <w:szCs w:val="20"/>
+        </w:rPr>
+        <w:t xml:space="preserve">Conforms: False</w:t>
+      </w:r>
+    </w:p>
+    <w:p>
+      <w:pPr>
+        <w:spacing w:after="0" w:before="0"/>
+      </w:pPr>
+      <w:r>
+        <w:rPr>
+          <w:rFonts w:ascii="Courier New" w:cs="Courier New" w:eastAsia="Courier New" w:hAnsi="Courier New"/>
+          <w:sz w:val="20"/>
+          <w:szCs w:val="20"/>
+        </w:rPr>
+        <w:t xml:space="preserve">Results (9)</w:t>
+      </w:r>
+    </w:p>
+    <w:p>
+      <w:r>
+        <w:t xml:space="preserve">(9 = 8 violaciones diseñadas, pero la del Origin genera 2 reportes porque sh:or registra cada sh:class fallido por separado)</w:t>
+      </w:r>
+    </w:p>
+    <w:p>
+      <w:r>
+        <w:t xml:space="preserve"/>
+      </w:r>
+    </w:p>
+    <w:p>
+      <w:pPr>
+        <w:pStyle w:val="Heading3"/>
+      </w:pPr>
+      <w:r>
+        <w:t xml:space="preserve">Tabla: violación diseñada → componente SHACL detectado</w:t>
+      </w:r>
+    </w:p>
+    <w:tbl>
+      <w:tblPr>
+        <w:tblW w:type="dxa" w:w="9360"/>
+        <w:tblBorders>
+          <w:top w:val="single" w:color="auto" w:sz="4"/>
+          <w:left w:val="single" w:color="auto" w:sz="4"/>
+          <w:bottom w:val="single" w:color="auto" w:sz="4"/>
+          <w:right w:val="single" w:color="auto" w:sz="4"/>
+          <w:insideH w:val="single" w:color="auto" w:sz="4"/>
+          <w:insideV w:val="single" w:color="auto" w:sz="4"/>
+        </w:tblBorders>
+      </w:tblPr>
+      <w:tblGrid>
+        <w:gridCol w:w="500"/>
+        <w:gridCol w:w="1900"/>
+        <w:gridCol w:w="2200"/>
+        <w:gridCol w:w="2360"/>
+        <w:gridCol w:w="2400"/>
+      </w:tblGrid>
+      <w:tr>
+        <w:tc>
+          <w:tcPr>
+            <w:tcW w:type="dxa" w:w="500"/>
+            <w:tcBorders>
+              <w:top w:val="single" w:color="CCCCCC" w:sz="1"/>
+              <w:left w:val="single" w:color="CCCCCC" w:sz="1"/>
+              <w:bottom w:val="single" w:color="CCCCCC" w:sz="1"/>
+              <w:right w:val="single" w:color="CCCCCC" w:sz="1"/>
+            </w:tcBorders>
+            <w:shd w:fill="F5D6D6" w:val="clear"/>
+            <w:tcMar>
+              <w:top w:type="dxa" w:w="80"/>
+              <w:left w:type="dxa" w:w="120"/>
+              <w:bottom w:type="dxa" w:w="80"/>
+              <w:right w:type="dxa" w:w="120"/>
+            </w:tcMar>
+          </w:tcPr>
+          <w:p>
+            <w:r>
+              <w:rPr>
+                <w:b/>
+                <w:bCs/>
+              </w:rPr>
+              <w:t xml:space="preserve">ID</w:t>
+            </w:r>
+          </w:p>
+        </w:tc>
+        <w:tc>
+          <w:tcPr>
+            <w:tcW w:type="dxa" w:w="1900"/>
+            <w:tcBorders>
+              <w:top w:val="single" w:color="CCCCCC" w:sz="1"/>
+              <w:left w:val="single" w:color="CCCCCC" w:sz="1"/>
+              <w:bottom w:val="single" w:color="CCCCCC" w:sz="1"/>
+              <w:right w:val="single" w:color="CCCCCC" w:sz="1"/>
+            </w:tcBorders>
+            <w:shd w:fill="F5D6D6" w:val="clear"/>
+            <w:tcMar>
+              <w:top w:type="dxa" w:w="80"/>
+              <w:left w:type="dxa" w:w="120"/>
+              <w:bottom w:type="dxa" w:w="80"/>
+              <w:right w:type="dxa" w:w="120"/>
+            </w:tcMar>
+          </w:tcPr>
+          <w:p>
+            <w:r>
+              <w:rPr>
+                <w:b/>
+                <w:bCs/>
+              </w:rPr>
+              <w:t xml:space="preserve">Nodo</w:t>
+            </w:r>
+          </w:p>
+        </w:tc>
+        <w:tc>
+          <w:tcPr>
+            <w:tcW w:type="dxa" w:w="2200"/>
+            <w:tcBorders>
+              <w:top w:val="single" w:color="CCCCCC" w:sz="1"/>
+              <w:left w:val="single" w:color="CCCCCC" w:sz="1"/>
+              <w:bottom w:val="single" w:color="CCCCCC" w:sz="1"/>
+              <w:right w:val="single" w:color="CCCCCC" w:sz="1"/>
+            </w:tcBorders>
+            <w:shd w:fill="F5D6D6" w:val="clear"/>
+            <w:tcMar>
+              <w:top w:type="dxa" w:w="80"/>
+              <w:left w:type="dxa" w:w="120"/>
+              <w:bottom w:type="dxa" w:w="80"/>
+              <w:right w:type="dxa" w:w="120"/>
+            </w:tcMar>
+          </w:tcPr>
+          <w:p>
+            <w:r>
+              <w:rPr>
+                <w:b/>
+                <w:bCs/>
+              </w:rPr>
+              <w:t xml:space="preserve">Qué se rompió</w:t>
+            </w:r>
+          </w:p>
+        </w:tc>
+        <w:tc>
+          <w:tcPr>
+            <w:tcW w:type="dxa" w:w="2360"/>
+            <w:tcBorders>
+              <w:top w:val="single" w:color="CCCCCC" w:sz="1"/>
+              <w:left w:val="single" w:color="CCCCCC" w:sz="1"/>
+              <w:bottom w:val="single" w:color="CCCCCC" w:sz="1"/>
+              <w:right w:val="single" w:color="CCCCCC" w:sz="1"/>
+            </w:tcBorders>
+            <w:shd w:fill="F5D6D6" w:val="clear"/>
+            <w:tcMar>
+              <w:top w:type="dxa" w:w="80"/>
+              <w:left w:type="dxa" w:w="120"/>
+              <w:bottom w:type="dxa" w:w="80"/>
+              <w:right w:type="dxa" w:w="120"/>
+            </w:tcMar>
+          </w:tcPr>
+          <w:p>
+            <w:r>
+              <w:rPr>
+                <w:b/>
+                <w:bCs/>
+              </w:rPr>
+              <w:t xml:space="preserve">Componente SHACL</w:t>
+            </w:r>
+          </w:p>
+        </w:tc>
+        <w:tc>
+          <w:tcPr>
+            <w:tcW w:type="dxa" w:w="2400"/>
+            <w:tcBorders>
+              <w:top w:val="single" w:color="CCCCCC" w:sz="1"/>
+              <w:left w:val="single" w:color="CCCCCC" w:sz="1"/>
+              <w:bottom w:val="single" w:color="CCCCCC" w:sz="1"/>
+              <w:right w:val="single" w:color="CCCCCC" w:sz="1"/>
+            </w:tcBorders>
+            <w:shd w:fill="F5D6D6" w:val="clear"/>
+            <w:tcMar>
+              <w:top w:type="dxa" w:w="80"/>
+              <w:left w:type="dxa" w:w="120"/>
+              <w:bottom w:type="dxa" w:w="80"/>
+              <w:right w:type="dxa" w:w="120"/>
+            </w:tcMar>
+          </w:tcPr>
+          <w:p>
+            <w:r>
+              <w:rPr>
+                <w:b/>
+                <w:bCs/>
+              </w:rPr>
+              <w:t xml:space="preserve">Shape</w:t>
+            </w:r>
+          </w:p>
+        </w:tc>
+      </w:tr>
+      <w:tr>
+        <w:tc>
+          <w:tcPr>
+            <w:tcW w:type="dxa" w:w="500"/>
+            <w:tcBorders>
+              <w:top w:val="single" w:color="CCCCCC" w:sz="1"/>
+              <w:left w:val="single" w:color="CCCCCC" w:sz="1"/>
+              <w:bottom w:val="single" w:color="CCCCCC" w:sz="1"/>
+              <w:right w:val="single" w:color="CCCCCC" w:sz="1"/>
+            </w:tcBorders>
+            <w:tcMar>
+              <w:top w:type="dxa" w:w="60"/>
+              <w:left w:type="dxa" w:w="120"/>
+              <w:bottom w:type="dxa" w:w="60"/>
+              <w:right w:type="dxa" w:w="120"/>
+            </w:tcMar>
+          </w:tcPr>
+          <w:p>
+            <w:r>
+              <w:rPr>
+                <w:sz w:val="18"/>
+                <w:szCs w:val="18"/>
+              </w:rPr>
+              <w:t xml:space="preserve">V1</w:t>
+            </w:r>
+          </w:p>
+        </w:tc>
+        <w:tc>
+          <w:tcPr>
+            <w:tcW w:type="dxa" w:w="1900"/>
+            <w:tcBorders>
+              <w:top w:val="single" w:color="CCCCCC" w:sz="1"/>
+              <w:left w:val="single" w:color="CCCCCC" w:sz="1"/>
+              <w:bottom w:val="single" w:color="CCCCCC" w:sz="1"/>
+              <w:right w:val="single" w:color="CCCCCC" w:sz="1"/>
+            </w:tcBorders>
+            <w:tcMar>
+              <w:top w:type="dxa" w:w="60"/>
+              <w:left w:type="dxa" w:w="120"/>
+              <w:bottom w:type="dxa" w:w="60"/>
+              <w:right w:type="dxa" w:w="120"/>
+            </w:tcMar>
+          </w:tcPr>
+          <w:p>
+            <w:r>
+              <w:rPr>
+                <w:rFonts w:ascii="Courier New" w:cs="Courier New" w:eastAsia="Courier New" w:hAnsi="Courier New"/>
+                <w:sz w:val="18"/>
+                <w:szCs w:val="18"/>
+              </w:rPr>
+              <w:t xml:space="preserve">ex:price_value_bad</w:t>
+            </w:r>
+          </w:p>
+        </w:tc>
+        <w:tc>
+          <w:tcPr>
+            <w:tcW w:type="dxa" w:w="2200"/>
+            <w:tcBorders>
+              <w:top w:val="single" w:color="CCCCCC" w:sz="1"/>
+              <w:left w:val="single" w:color="CCCCCC" w:sz="1"/>
+              <w:bottom w:val="single" w:color="CCCCCC" w:sz="1"/>
+              <w:right w:val="single" w:color="CCCCCC" w:sz="1"/>
+            </w:tcBorders>
+            <w:tcMar>
+              <w:top w:type="dxa" w:w="60"/>
+              <w:left w:type="dxa" w:w="120"/>
+              <w:bottom w:type="dxa" w:w="60"/>
+              <w:right w:type="dxa" w:w="120"/>
+            </w:tcMar>
+          </w:tcPr>
+          <w:p>
+            <w:r>
+              <w:rPr>
+                <w:sz w:val="18"/>
+                <w:szCs w:val="18"/>
+              </w:rPr>
+              <w:t xml:space="preserve">gr:hasCurrency = 'dolares'</w:t>
+            </w:r>
+          </w:p>
+        </w:tc>
+        <w:tc>
+          <w:tcPr>
+            <w:tcW w:type="dxa" w:w="2360"/>
+            <w:tcBorders>
+              <w:top w:val="single" w:color="CCCCCC" w:sz="1"/>
+              <w:left w:val="single" w:color="CCCCCC" w:sz="1"/>
+              <w:bottom w:val="single" w:color="CCCCCC" w:sz="1"/>
+              <w:right w:val="single" w:color="CCCCCC" w:sz="1"/>
+            </w:tcBorders>
+            <w:tcMar>
+              <w:top w:type="dxa" w:w="60"/>
+              <w:left w:type="dxa" w:w="120"/>
+              <w:bottom w:type="dxa" w:w="60"/>
+              <w:right w:type="dxa" w:w="120"/>
+            </w:tcMar>
+          </w:tcPr>
+          <w:p>
+            <w:r>
+              <w:rPr>
+                <w:sz w:val="18"/>
+                <w:szCs w:val="18"/>
+              </w:rPr>
+              <w:t xml:space="preserve">PatternConstraintComponent (sh:pattern)</w:t>
+            </w:r>
+          </w:p>
+        </w:tc>
+        <w:tc>
+          <w:tcPr>
+            <w:tcW w:type="dxa" w:w="2400"/>
+            <w:tcBorders>
+              <w:top w:val="single" w:color="CCCCCC" w:sz="1"/>
+              <w:left w:val="single" w:color="CCCCCC" w:sz="1"/>
+              <w:bottom w:val="single" w:color="CCCCCC" w:sz="1"/>
+              <w:right w:val="single" w:color="CCCCCC" w:sz="1"/>
+            </w:tcBorders>
+            <w:tcMar>
+              <w:top w:type="dxa" w:w="60"/>
+              <w:left w:type="dxa" w:w="120"/>
+              <w:bottom w:type="dxa" w:w="60"/>
+              <w:right w:type="dxa" w:w="120"/>
+            </w:tcMar>
+          </w:tcPr>
+          <w:p>
+            <w:r>
+              <w:rPr>
+                <w:rFonts w:ascii="Courier New" w:cs="Courier New" w:eastAsia="Courier New" w:hAnsi="Courier New"/>
+                <w:sz w:val="18"/>
+                <w:szCs w:val="18"/>
+              </w:rPr>
+              <w:t xml:space="preserve">UnitPriceSpecificationShape</w:t>
+            </w:r>
+          </w:p>
+        </w:tc>
+      </w:tr>
+      <w:tr>
+        <w:tc>
+          <w:tcPr>
+            <w:tcW w:type="dxa" w:w="500"/>
+            <w:tcBorders>
+              <w:top w:val="single" w:color="CCCCCC" w:sz="1"/>
+              <w:left w:val="single" w:color="CCCCCC" w:sz="1"/>
+              <w:bottom w:val="single" w:color="CCCCCC" w:sz="1"/>
+              <w:right w:val="single" w:color="CCCCCC" w:sz="1"/>
+            </w:tcBorders>
+            <w:tcMar>
+              <w:top w:type="dxa" w:w="60"/>
+              <w:left w:type="dxa" w:w="120"/>
+              <w:bottom w:type="dxa" w:w="60"/>
+              <w:right w:type="dxa" w:w="120"/>
+            </w:tcMar>
+          </w:tcPr>
+          <w:p>
+            <w:r>
+              <w:rPr>
+                <w:sz w:val="18"/>
+                <w:szCs w:val="18"/>
+              </w:rPr>
+              <w:t xml:space="preserve">V2</w:t>
+            </w:r>
+          </w:p>
+        </w:tc>
+        <w:tc>
+          <w:tcPr>
+            <w:tcW w:type="dxa" w:w="1900"/>
+            <w:tcBorders>
+              <w:top w:val="single" w:color="CCCCCC" w:sz="1"/>
+              <w:left w:val="single" w:color="CCCCCC" w:sz="1"/>
+              <w:bottom w:val="single" w:color="CCCCCC" w:sz="1"/>
+              <w:right w:val="single" w:color="CCCCCC" w:sz="1"/>
+            </w:tcBorders>
+            <w:tcMar>
+              <w:top w:type="dxa" w:w="60"/>
+              <w:left w:type="dxa" w:w="120"/>
+              <w:bottom w:type="dxa" w:w="60"/>
+              <w:right w:type="dxa" w:w="120"/>
+            </w:tcMar>
+          </w:tcPr>
+          <w:p>
+            <w:r>
+              <w:rPr>
+                <w:rFonts w:ascii="Courier New" w:cs="Courier New" w:eastAsia="Courier New" w:hAnsi="Courier New"/>
+                <w:sz w:val="18"/>
+                <w:szCs w:val="18"/>
+              </w:rPr>
+              <w:t xml:space="preserve">ex:price_value_bad</w:t>
+            </w:r>
+          </w:p>
+        </w:tc>
+        <w:tc>
+          <w:tcPr>
+            <w:tcW w:type="dxa" w:w="2200"/>
+            <w:tcBorders>
+              <w:top w:val="single" w:color="CCCCCC" w:sz="1"/>
+              <w:left w:val="single" w:color="CCCCCC" w:sz="1"/>
+              <w:bottom w:val="single" w:color="CCCCCC" w:sz="1"/>
+              <w:right w:val="single" w:color="CCCCCC" w:sz="1"/>
+            </w:tcBorders>
+            <w:tcMar>
+              <w:top w:type="dxa" w:w="60"/>
+              <w:left w:type="dxa" w:w="120"/>
+              <w:bottom w:type="dxa" w:w="60"/>
+              <w:right w:type="dxa" w:w="120"/>
+            </w:tcMar>
+          </w:tcPr>
+          <w:p>
+            <w:r>
+              <w:rPr>
+                <w:sz w:val="18"/>
+                <w:szCs w:val="18"/>
+              </w:rPr>
+              <w:t xml:space="preserve">gr:hasCurrencyValue = -50000.0</w:t>
+            </w:r>
+          </w:p>
+        </w:tc>
+        <w:tc>
+          <w:tcPr>
+            <w:tcW w:type="dxa" w:w="2360"/>
+            <w:tcBorders>
+              <w:top w:val="single" w:color="CCCCCC" w:sz="1"/>
+              <w:left w:val="single" w:color="CCCCCC" w:sz="1"/>
+              <w:bottom w:val="single" w:color="CCCCCC" w:sz="1"/>
+              <w:right w:val="single" w:color="CCCCCC" w:sz="1"/>
+            </w:tcBorders>
+            <w:tcMar>
+              <w:top w:type="dxa" w:w="60"/>
+              <w:left w:type="dxa" w:w="120"/>
+              <w:bottom w:type="dxa" w:w="60"/>
+              <w:right w:type="dxa" w:w="120"/>
+            </w:tcMar>
+          </w:tcPr>
+          <w:p>
+            <w:r>
+              <w:rPr>
+                <w:sz w:val="18"/>
+                <w:szCs w:val="18"/>
+              </w:rPr>
+              <w:t xml:space="preserve">MinExclusiveConstraintComponent</w:t>
+            </w:r>
+          </w:p>
+        </w:tc>
+        <w:tc>
+          <w:tcPr>
+            <w:tcW w:type="dxa" w:w="2400"/>
+            <w:tcBorders>
+              <w:top w:val="single" w:color="CCCCCC" w:sz="1"/>
+              <w:left w:val="single" w:color="CCCCCC" w:sz="1"/>
+              <w:bottom w:val="single" w:color="CCCCCC" w:sz="1"/>
+              <w:right w:val="single" w:color="CCCCCC" w:sz="1"/>
+            </w:tcBorders>
+            <w:tcMar>
+              <w:top w:type="dxa" w:w="60"/>
+              <w:left w:type="dxa" w:w="120"/>
+              <w:bottom w:type="dxa" w:w="60"/>
+              <w:right w:type="dxa" w:w="120"/>
+            </w:tcMar>
+          </w:tcPr>
+          <w:p>
+            <w:r>
+              <w:rPr>
+                <w:rFonts w:ascii="Courier New" w:cs="Courier New" w:eastAsia="Courier New" w:hAnsi="Courier New"/>
+                <w:sz w:val="18"/>
+                <w:szCs w:val="18"/>
+              </w:rPr>
+              <w:t xml:space="preserve">UnitPriceSpecificationShape</w:t>
+            </w:r>
+          </w:p>
+        </w:tc>
+      </w:tr>
+      <w:tr>
+        <w:tc>
+          <w:tcPr>
+            <w:tcW w:type="dxa" w:w="500"/>
+            <w:tcBorders>
+              <w:top w:val="single" w:color="CCCCCC" w:sz="1"/>
+              <w:left w:val="single" w:color="CCCCCC" w:sz="1"/>
+              <w:bottom w:val="single" w:color="CCCCCC" w:sz="1"/>
+              <w:right w:val="single" w:color="CCCCCC" w:sz="1"/>
+            </w:tcBorders>
+            <w:tcMar>
+              <w:top w:type="dxa" w:w="60"/>
+              <w:left w:type="dxa" w:w="120"/>
+              <w:bottom w:type="dxa" w:w="60"/>
+              <w:right w:type="dxa" w:w="120"/>
+            </w:tcMar>
+          </w:tcPr>
+          <w:p>
+            <w:r>
+              <w:rPr>
+                <w:sz w:val="18"/>
+                <w:szCs w:val="18"/>
+              </w:rPr>
+              <w:t xml:space="preserve">V3</w:t>
+            </w:r>
+          </w:p>
+        </w:tc>
+        <w:tc>
+          <w:tcPr>
+            <w:tcW w:type="dxa" w:w="1900"/>
+            <w:tcBorders>
+              <w:top w:val="single" w:color="CCCCCC" w:sz="1"/>
+              <w:left w:val="single" w:color="CCCCCC" w:sz="1"/>
+              <w:bottom w:val="single" w:color="CCCCCC" w:sz="1"/>
+              <w:right w:val="single" w:color="CCCCCC" w:sz="1"/>
+            </w:tcBorders>
+            <w:tcMar>
+              <w:top w:type="dxa" w:w="60"/>
+              <w:left w:type="dxa" w:w="120"/>
+              <w:bottom w:type="dxa" w:w="60"/>
+              <w:right w:type="dxa" w:w="120"/>
+            </w:tcMar>
+          </w:tcPr>
+          <w:p>
+            <w:r>
+              <w:rPr>
+                <w:rFonts w:ascii="Courier New" w:cs="Courier New" w:eastAsia="Courier New" w:hAnsi="Courier New"/>
+                <w:sz w:val="18"/>
+                <w:szCs w:val="18"/>
+              </w:rPr>
+              <w:t xml:space="preserve">ex:listing_bad</w:t>
+            </w:r>
+          </w:p>
+        </w:tc>
+        <w:tc>
+          <w:tcPr>
+            <w:tcW w:type="dxa" w:w="2200"/>
+            <w:tcBorders>
+              <w:top w:val="single" w:color="CCCCCC" w:sz="1"/>
+              <w:left w:val="single" w:color="CCCCCC" w:sz="1"/>
+              <w:bottom w:val="single" w:color="CCCCCC" w:sz="1"/>
+              <w:right w:val="single" w:color="CCCCCC" w:sz="1"/>
+            </w:tcBorders>
+            <w:tcMar>
+              <w:top w:type="dxa" w:w="60"/>
+              <w:left w:type="dxa" w:w="120"/>
+              <w:bottom w:type="dxa" w:w="60"/>
+              <w:right w:type="dxa" w:w="120"/>
+            </w:tcMar>
+          </w:tcPr>
+          <w:p>
+            <w:r>
+              <w:rPr>
+                <w:sz w:val="18"/>
+                <w:szCs w:val="18"/>
+              </w:rPr>
+              <w:t xml:space="preserve">sin sioc:has_creator</w:t>
+            </w:r>
+          </w:p>
+        </w:tc>
+        <w:tc>
+          <w:tcPr>
+            <w:tcW w:type="dxa" w:w="2360"/>
+            <w:tcBorders>
+              <w:top w:val="single" w:color="CCCCCC" w:sz="1"/>
+              <w:left w:val="single" w:color="CCCCCC" w:sz="1"/>
+              <w:bottom w:val="single" w:color="CCCCCC" w:sz="1"/>
+              <w:right w:val="single" w:color="CCCCCC" w:sz="1"/>
+            </w:tcBorders>
+            <w:tcMar>
+              <w:top w:type="dxa" w:w="60"/>
+              <w:left w:type="dxa" w:w="120"/>
+              <w:bottom w:type="dxa" w:w="60"/>
+              <w:right w:type="dxa" w:w="120"/>
+            </w:tcMar>
+          </w:tcPr>
+          <w:p>
+            <w:r>
+              <w:rPr>
+                <w:sz w:val="18"/>
+                <w:szCs w:val="18"/>
+              </w:rPr>
+              <w:t xml:space="preserve">MinCountConstraintComponent</w:t>
+            </w:r>
+          </w:p>
+        </w:tc>
+        <w:tc>
+          <w:tcPr>
+            <w:tcW w:type="dxa" w:w="2400"/>
+            <w:tcBorders>
+              <w:top w:val="single" w:color="CCCCCC" w:sz="1"/>
+              <w:left w:val="single" w:color="CCCCCC" w:sz="1"/>
+              <w:bottom w:val="single" w:color="CCCCCC" w:sz="1"/>
+              <w:right w:val="single" w:color="CCCCCC" w:sz="1"/>
+            </w:tcBorders>
+            <w:tcMar>
+              <w:top w:type="dxa" w:w="60"/>
+              <w:left w:type="dxa" w:w="120"/>
+              <w:bottom w:type="dxa" w:w="60"/>
+              <w:right w:type="dxa" w:w="120"/>
+            </w:tcMar>
+          </w:tcPr>
+          <w:p>
+            <w:r>
+              <w:rPr>
+                <w:rFonts w:ascii="Courier New" w:cs="Courier New" w:eastAsia="Courier New" w:hAnsi="Courier New"/>
+                <w:sz w:val="18"/>
+                <w:szCs w:val="18"/>
+              </w:rPr>
+              <w:t xml:space="preserve">RealEstateListingShape</w:t>
+            </w:r>
+          </w:p>
+        </w:tc>
+      </w:tr>
+      <w:tr>
+        <w:tc>
+          <w:tcPr>
+            <w:tcW w:type="dxa" w:w="500"/>
+            <w:tcBorders>
+              <w:top w:val="single" w:color="CCCCCC" w:sz="1"/>
+              <w:left w:val="single" w:color="CCCCCC" w:sz="1"/>
+              <w:bottom w:val="single" w:color="CCCCCC" w:sz="1"/>
+              <w:right w:val="single" w:color="CCCCCC" w:sz="1"/>
+            </w:tcBorders>
+            <w:tcMar>
+              <w:top w:type="dxa" w:w="60"/>
+              <w:left w:type="dxa" w:w="120"/>
+              <w:bottom w:type="dxa" w:w="60"/>
+              <w:right w:type="dxa" w:w="120"/>
+            </w:tcMar>
+          </w:tcPr>
+          <w:p>
+            <w:r>
+              <w:rPr>
+                <w:sz w:val="18"/>
+                <w:szCs w:val="18"/>
+              </w:rPr>
+              <w:t xml:space="preserve">V4</w:t>
+            </w:r>
+          </w:p>
+        </w:tc>
+        <w:tc>
+          <w:tcPr>
+            <w:tcW w:type="dxa" w:w="1900"/>
+            <w:tcBorders>
+              <w:top w:val="single" w:color="CCCCCC" w:sz="1"/>
+              <w:left w:val="single" w:color="CCCCCC" w:sz="1"/>
+              <w:bottom w:val="single" w:color="CCCCCC" w:sz="1"/>
+              <w:right w:val="single" w:color="CCCCCC" w:sz="1"/>
+            </w:tcBorders>
+            <w:tcMar>
+              <w:top w:type="dxa" w:w="60"/>
+              <w:left w:type="dxa" w:w="120"/>
+              <w:bottom w:type="dxa" w:w="60"/>
+              <w:right w:type="dxa" w:w="120"/>
+            </w:tcMar>
+          </w:tcPr>
+          <w:p>
+            <w:r>
+              <w:rPr>
+                <w:rFonts w:ascii="Courier New" w:cs="Courier New" w:eastAsia="Courier New" w:hAnsi="Courier New"/>
+                <w:sz w:val="18"/>
+                <w:szCs w:val="18"/>
+              </w:rPr>
+              <w:t xml:space="preserve">ex:listing_bad</w:t>
+            </w:r>
+          </w:p>
+        </w:tc>
+        <w:tc>
+          <w:tcPr>
+            <w:tcW w:type="dxa" w:w="2200"/>
+            <w:tcBorders>
+              <w:top w:val="single" w:color="CCCCCC" w:sz="1"/>
+              <w:left w:val="single" w:color="CCCCCC" w:sz="1"/>
+              <w:bottom w:val="single" w:color="CCCCCC" w:sz="1"/>
+              <w:right w:val="single" w:color="CCCCCC" w:sz="1"/>
+            </w:tcBorders>
+            <w:tcMar>
+              <w:top w:type="dxa" w:w="60"/>
+              <w:left w:type="dxa" w:w="120"/>
+              <w:bottom w:type="dxa" w:w="60"/>
+              <w:right w:type="dxa" w:w="120"/>
+            </w:tcMar>
+          </w:tcPr>
+          <w:p>
+            <w:r>
+              <w:rPr>
+                <w:sz w:val="18"/>
+                <w:szCs w:val="18"/>
+              </w:rPr>
+              <w:t xml:space="preserve">gr:hasBusinessFunction = gr:Repair</w:t>
+            </w:r>
+          </w:p>
+        </w:tc>
+        <w:tc>
+          <w:tcPr>
+            <w:tcW w:type="dxa" w:w="2360"/>
+            <w:tcBorders>
+              <w:top w:val="single" w:color="CCCCCC" w:sz="1"/>
+              <w:left w:val="single" w:color="CCCCCC" w:sz="1"/>
+              <w:bottom w:val="single" w:color="CCCCCC" w:sz="1"/>
+              <w:right w:val="single" w:color="CCCCCC" w:sz="1"/>
+            </w:tcBorders>
+            <w:tcMar>
+              <w:top w:type="dxa" w:w="60"/>
+              <w:left w:type="dxa" w:w="120"/>
+              <w:bottom w:type="dxa" w:w="60"/>
+              <w:right w:type="dxa" w:w="120"/>
+            </w:tcMar>
+          </w:tcPr>
+          <w:p>
+            <w:r>
+              <w:rPr>
+                <w:sz w:val="18"/>
+                <w:szCs w:val="18"/>
+              </w:rPr>
+              <w:t xml:space="preserve">InConstraintComponent (sh:in)</w:t>
+            </w:r>
+          </w:p>
+        </w:tc>
+        <w:tc>
+          <w:tcPr>
+            <w:tcW w:type="dxa" w:w="2400"/>
+            <w:tcBorders>
+              <w:top w:val="single" w:color="CCCCCC" w:sz="1"/>
+              <w:left w:val="single" w:color="CCCCCC" w:sz="1"/>
+              <w:bottom w:val="single" w:color="CCCCCC" w:sz="1"/>
+              <w:right w:val="single" w:color="CCCCCC" w:sz="1"/>
+            </w:tcBorders>
+            <w:tcMar>
+              <w:top w:type="dxa" w:w="60"/>
+              <w:left w:type="dxa" w:w="120"/>
+              <w:bottom w:type="dxa" w:w="60"/>
+              <w:right w:type="dxa" w:w="120"/>
+            </w:tcMar>
+          </w:tcPr>
+          <w:p>
+            <w:r>
+              <w:rPr>
+                <w:rFonts w:ascii="Courier New" w:cs="Courier New" w:eastAsia="Courier New" w:hAnsi="Courier New"/>
+                <w:sz w:val="18"/>
+                <w:szCs w:val="18"/>
+              </w:rPr>
+              <w:t xml:space="preserve">RealEstateListingShape</w:t>
+            </w:r>
+          </w:p>
+        </w:tc>
+      </w:tr>
+      <w:tr>
+        <w:tc>
+          <w:tcPr>
+            <w:tcW w:type="dxa" w:w="500"/>
+            <w:tcBorders>
+              <w:top w:val="single" w:color="CCCCCC" w:sz="1"/>
+              <w:left w:val="single" w:color="CCCCCC" w:sz="1"/>
+              <w:bottom w:val="single" w:color="CCCCCC" w:sz="1"/>
+              <w:right w:val="single" w:color="CCCCCC" w:sz="1"/>
+            </w:tcBorders>
+            <w:tcMar>
+              <w:top w:type="dxa" w:w="60"/>
+              <w:left w:type="dxa" w:w="120"/>
+              <w:bottom w:type="dxa" w:w="60"/>
+              <w:right w:type="dxa" w:w="120"/>
+            </w:tcMar>
+          </w:tcPr>
+          <w:p>
+            <w:r>
+              <w:rPr>
+                <w:sz w:val="18"/>
+                <w:szCs w:val="18"/>
+              </w:rPr>
+              <w:t xml:space="preserve">V5</w:t>
+            </w:r>
+          </w:p>
+        </w:tc>
+        <w:tc>
+          <w:tcPr>
+            <w:tcW w:type="dxa" w:w="1900"/>
+            <w:tcBorders>
+              <w:top w:val="single" w:color="CCCCCC" w:sz="1"/>
+              <w:left w:val="single" w:color="CCCCCC" w:sz="1"/>
+              <w:bottom w:val="single" w:color="CCCCCC" w:sz="1"/>
+              <w:right w:val="single" w:color="CCCCCC" w:sz="1"/>
+            </w:tcBorders>
+            <w:tcMar>
+              <w:top w:type="dxa" w:w="60"/>
+              <w:left w:type="dxa" w:w="120"/>
+              <w:bottom w:type="dxa" w:w="60"/>
+              <w:right w:type="dxa" w:w="120"/>
+            </w:tcMar>
+          </w:tcPr>
+          <w:p>
+            <w:r>
+              <w:rPr>
+                <w:rFonts w:ascii="Courier New" w:cs="Courier New" w:eastAsia="Courier New" w:hAnsi="Courier New"/>
+                <w:sz w:val="18"/>
+                <w:szCs w:val="18"/>
+              </w:rPr>
+              <w:t xml:space="preserve">ex:house_bad</w:t>
+            </w:r>
+          </w:p>
+        </w:tc>
+        <w:tc>
+          <w:tcPr>
+            <w:tcW w:type="dxa" w:w="2200"/>
+            <w:tcBorders>
+              <w:top w:val="single" w:color="CCCCCC" w:sz="1"/>
+              <w:left w:val="single" w:color="CCCCCC" w:sz="1"/>
+              <w:bottom w:val="single" w:color="CCCCCC" w:sz="1"/>
+              <w:right w:val="single" w:color="CCCCCC" w:sz="1"/>
+            </w:tcBorders>
+            <w:tcMar>
+              <w:top w:type="dxa" w:w="60"/>
+              <w:left w:type="dxa" w:w="120"/>
+              <w:bottom w:type="dxa" w:w="60"/>
+              <w:right w:type="dxa" w:w="120"/>
+            </w:tcMar>
+          </w:tcPr>
+          <w:p>
+            <w:r>
+              <w:rPr>
+                <w:sz w:val="18"/>
+                <w:szCs w:val="18"/>
+              </w:rPr>
+              <w:t xml:space="preserve">Casa sin io:RoomAmnt entre sus features</w:t>
+            </w:r>
+          </w:p>
+        </w:tc>
+        <w:tc>
+          <w:tcPr>
+            <w:tcW w:type="dxa" w:w="2360"/>
+            <w:tcBorders>
+              <w:top w:val="single" w:color="CCCCCC" w:sz="1"/>
+              <w:left w:val="single" w:color="CCCCCC" w:sz="1"/>
+              <w:bottom w:val="single" w:color="CCCCCC" w:sz="1"/>
+              <w:right w:val="single" w:color="CCCCCC" w:sz="1"/>
+            </w:tcBorders>
+            <w:tcMar>
+              <w:top w:type="dxa" w:w="60"/>
+              <w:left w:type="dxa" w:w="120"/>
+              <w:bottom w:type="dxa" w:w="60"/>
+              <w:right w:type="dxa" w:w="120"/>
+            </w:tcMar>
+          </w:tcPr>
+          <w:p>
+            <w:r>
+              <w:rPr>
+                <w:sz w:val="18"/>
+                <w:szCs w:val="18"/>
+              </w:rPr>
+              <w:t xml:space="preserve">QualifiedMinCountConstraintComponent</w:t>
+            </w:r>
+          </w:p>
+        </w:tc>
+        <w:tc>
+          <w:tcPr>
+            <w:tcW w:type="dxa" w:w="2400"/>
+            <w:tcBorders>
+              <w:top w:val="single" w:color="CCCCCC" w:sz="1"/>
+              <w:left w:val="single" w:color="CCCCCC" w:sz="1"/>
+              <w:bottom w:val="single" w:color="CCCCCC" w:sz="1"/>
+              <w:right w:val="single" w:color="CCCCCC" w:sz="1"/>
+            </w:tcBorders>
+            <w:tcMar>
+              <w:top w:type="dxa" w:w="60"/>
+              <w:left w:type="dxa" w:w="120"/>
+              <w:bottom w:type="dxa" w:w="60"/>
+              <w:right w:type="dxa" w:w="120"/>
+            </w:tcMar>
+          </w:tcPr>
+          <w:p>
+            <w:r>
+              <w:rPr>
+                <w:rFonts w:ascii="Courier New" w:cs="Courier New" w:eastAsia="Courier New" w:hAnsi="Courier New"/>
+                <w:sz w:val="18"/>
+                <w:szCs w:val="18"/>
+              </w:rPr>
+              <w:t xml:space="preserve">HouseShape</w:t>
+            </w:r>
+          </w:p>
+        </w:tc>
+      </w:tr>
+      <w:tr>
+        <w:tc>
+          <w:tcPr>
+            <w:tcW w:type="dxa" w:w="500"/>
+            <w:tcBorders>
+              <w:top w:val="single" w:color="CCCCCC" w:sz="1"/>
+              <w:left w:val="single" w:color="CCCCCC" w:sz="1"/>
+              <w:bottom w:val="single" w:color="CCCCCC" w:sz="1"/>
+              <w:right w:val="single" w:color="CCCCCC" w:sz="1"/>
+            </w:tcBorders>
+            <w:tcMar>
+              <w:top w:type="dxa" w:w="60"/>
+              <w:left w:type="dxa" w:w="120"/>
+              <w:bottom w:type="dxa" w:w="60"/>
+              <w:right w:type="dxa" w:w="120"/>
+            </w:tcMar>
+          </w:tcPr>
+          <w:p>
+            <w:r>
+              <w:rPr>
+                <w:sz w:val="18"/>
+                <w:szCs w:val="18"/>
+              </w:rPr>
+              <w:t xml:space="preserve">V6</w:t>
+            </w:r>
+          </w:p>
+        </w:tc>
+        <w:tc>
+          <w:tcPr>
+            <w:tcW w:type="dxa" w:w="1900"/>
+            <w:tcBorders>
+              <w:top w:val="single" w:color="CCCCCC" w:sz="1"/>
+              <w:left w:val="single" w:color="CCCCCC" w:sz="1"/>
+              <w:bottom w:val="single" w:color="CCCCCC" w:sz="1"/>
+              <w:right w:val="single" w:color="CCCCCC" w:sz="1"/>
+            </w:tcBorders>
+            <w:tcMar>
+              <w:top w:type="dxa" w:w="60"/>
+              <w:left w:type="dxa" w:w="120"/>
+              <w:bottom w:type="dxa" w:w="60"/>
+              <w:right w:type="dxa" w:w="120"/>
+            </w:tcMar>
+          </w:tcPr>
+          <w:p>
+            <w:r>
+              <w:rPr>
+                <w:rFonts w:ascii="Courier New" w:cs="Courier New" w:eastAsia="Courier New" w:hAnsi="Courier New"/>
+                <w:sz w:val="18"/>
+                <w:szCs w:val="18"/>
+              </w:rPr>
+              <w:t xml:space="preserve">ex:postal_address_bad</w:t>
+            </w:r>
+          </w:p>
+        </w:tc>
+        <w:tc>
+          <w:tcPr>
+            <w:tcW w:type="dxa" w:w="2200"/>
+            <w:tcBorders>
+              <w:top w:val="single" w:color="CCCCCC" w:sz="1"/>
+              <w:left w:val="single" w:color="CCCCCC" w:sz="1"/>
+              <w:bottom w:val="single" w:color="CCCCCC" w:sz="1"/>
+              <w:right w:val="single" w:color="CCCCCC" w:sz="1"/>
+            </w:tcBorders>
+            <w:tcMar>
+              <w:top w:type="dxa" w:w="60"/>
+              <w:left w:type="dxa" w:w="120"/>
+              <w:bottom w:type="dxa" w:w="60"/>
+              <w:right w:type="dxa" w:w="120"/>
+            </w:tcMar>
+          </w:tcPr>
+          <w:p>
+            <w:r>
+              <w:rPr>
+                <w:sz w:val="18"/>
+                <w:szCs w:val="18"/>
+              </w:rPr>
+              <w:t xml:space="preserve">sin io:province</w:t>
+            </w:r>
+          </w:p>
+        </w:tc>
+        <w:tc>
+          <w:tcPr>
+            <w:tcW w:type="dxa" w:w="2360"/>
+            <w:tcBorders>
+              <w:top w:val="single" w:color="CCCCCC" w:sz="1"/>
+              <w:left w:val="single" w:color="CCCCCC" w:sz="1"/>
+              <w:bottom w:val="single" w:color="CCCCCC" w:sz="1"/>
+              <w:right w:val="single" w:color="CCCCCC" w:sz="1"/>
+            </w:tcBorders>
+            <w:tcMar>
+              <w:top w:type="dxa" w:w="60"/>
+              <w:left w:type="dxa" w:w="120"/>
+              <w:bottom w:type="dxa" w:w="60"/>
+              <w:right w:type="dxa" w:w="120"/>
+            </w:tcMar>
+          </w:tcPr>
+          <w:p>
+            <w:r>
+              <w:rPr>
+                <w:sz w:val="18"/>
+                <w:szCs w:val="18"/>
+              </w:rPr>
+              <w:t xml:space="preserve">MinCountConstraintComponent</w:t>
+            </w:r>
+          </w:p>
+        </w:tc>
+        <w:tc>
+          <w:tcPr>
+            <w:tcW w:type="dxa" w:w="2400"/>
+            <w:tcBorders>
+              <w:top w:val="single" w:color="CCCCCC" w:sz="1"/>
+              <w:left w:val="single" w:color="CCCCCC" w:sz="1"/>
+              <w:bottom w:val="single" w:color="CCCCCC" w:sz="1"/>
+              <w:right w:val="single" w:color="CCCCCC" w:sz="1"/>
+            </w:tcBorders>
+            <w:tcMar>
+              <w:top w:type="dxa" w:w="60"/>
+              <w:left w:type="dxa" w:w="120"/>
+              <w:bottom w:type="dxa" w:w="60"/>
+              <w:right w:type="dxa" w:w="120"/>
+            </w:tcMar>
+          </w:tcPr>
+          <w:p>
+            <w:r>
+              <w:rPr>
+                <w:rFonts w:ascii="Courier New" w:cs="Courier New" w:eastAsia="Courier New" w:hAnsi="Courier New"/>
+                <w:sz w:val="18"/>
+                <w:szCs w:val="18"/>
+              </w:rPr>
+              <w:t xml:space="preserve">PostalAddressShape</w:t>
+            </w:r>
+          </w:p>
+        </w:tc>
+      </w:tr>
+      <w:tr>
+        <w:tc>
+          <w:tcPr>
+            <w:tcW w:type="dxa" w:w="500"/>
+            <w:tcBorders>
+              <w:top w:val="single" w:color="CCCCCC" w:sz="1"/>
+              <w:left w:val="single" w:color="CCCCCC" w:sz="1"/>
+              <w:bottom w:val="single" w:color="CCCCCC" w:sz="1"/>
+              <w:right w:val="single" w:color="CCCCCC" w:sz="1"/>
+            </w:tcBorders>
+            <w:tcMar>
+              <w:top w:type="dxa" w:w="60"/>
+              <w:left w:type="dxa" w:w="120"/>
+              <w:bottom w:type="dxa" w:w="60"/>
+              <w:right w:type="dxa" w:w="120"/>
+            </w:tcMar>
+          </w:tcPr>
+          <w:p>
+            <w:r>
+              <w:rPr>
+                <w:sz w:val="18"/>
+                <w:szCs w:val="18"/>
+              </w:rPr>
+              <w:t xml:space="preserve">V7</w:t>
+            </w:r>
+          </w:p>
+        </w:tc>
+        <w:tc>
+          <w:tcPr>
+            <w:tcW w:type="dxa" w:w="1900"/>
+            <w:tcBorders>
+              <w:top w:val="single" w:color="CCCCCC" w:sz="1"/>
+              <w:left w:val="single" w:color="CCCCCC" w:sz="1"/>
+              <w:bottom w:val="single" w:color="CCCCCC" w:sz="1"/>
+              <w:right w:val="single" w:color="CCCCCC" w:sz="1"/>
+            </w:tcBorders>
+            <w:tcMar>
+              <w:top w:type="dxa" w:w="60"/>
+              <w:left w:type="dxa" w:w="120"/>
+              <w:bottom w:type="dxa" w:w="60"/>
+              <w:right w:type="dxa" w:w="120"/>
+            </w:tcMar>
+          </w:tcPr>
+          <w:p>
+            <w:r>
+              <w:rPr>
+                <w:rFonts w:ascii="Courier New" w:cs="Courier New" w:eastAsia="Courier New" w:hAnsi="Courier New"/>
+                <w:sz w:val="18"/>
+                <w:szCs w:val="18"/>
+              </w:rPr>
+              <w:t xml:space="preserve">ex:postal_address_bad</w:t>
+            </w:r>
+          </w:p>
+        </w:tc>
+        <w:tc>
+          <w:tcPr>
+            <w:tcW w:type="dxa" w:w="2200"/>
+            <w:tcBorders>
+              <w:top w:val="single" w:color="CCCCCC" w:sz="1"/>
+              <w:left w:val="single" w:color="CCCCCC" w:sz="1"/>
+              <w:bottom w:val="single" w:color="CCCCCC" w:sz="1"/>
+              <w:right w:val="single" w:color="CCCCCC" w:sz="1"/>
+            </w:tcBorders>
+            <w:tcMar>
+              <w:top w:type="dxa" w:w="60"/>
+              <w:left w:type="dxa" w:w="120"/>
+              <w:bottom w:type="dxa" w:w="60"/>
+              <w:right w:type="dxa" w:w="120"/>
+            </w:tcMar>
+          </w:tcPr>
+          <w:p>
+            <w:r>
+              <w:rPr>
+                <w:sz w:val="18"/>
+                <w:szCs w:val="18"/>
+              </w:rPr>
+              <w:t xml:space="preserve">io:neighborhood = 'Centro' (string)</w:t>
+            </w:r>
+          </w:p>
+        </w:tc>
+        <w:tc>
+          <w:tcPr>
+            <w:tcW w:type="dxa" w:w="2360"/>
+            <w:tcBorders>
+              <w:top w:val="single" w:color="CCCCCC" w:sz="1"/>
+              <w:left w:val="single" w:color="CCCCCC" w:sz="1"/>
+              <w:bottom w:val="single" w:color="CCCCCC" w:sz="1"/>
+              <w:right w:val="single" w:color="CCCCCC" w:sz="1"/>
+            </w:tcBorders>
+            <w:tcMar>
+              <w:top w:type="dxa" w:w="60"/>
+              <w:left w:type="dxa" w:w="120"/>
+              <w:bottom w:type="dxa" w:w="60"/>
+              <w:right w:type="dxa" w:w="120"/>
+            </w:tcMar>
+          </w:tcPr>
+          <w:p>
+            <w:r>
+              <w:rPr>
+                <w:sz w:val="18"/>
+                <w:szCs w:val="18"/>
+              </w:rPr>
+              <w:t xml:space="preserve">ClassConstraintComponent (sh:class)</w:t>
+            </w:r>
+          </w:p>
+        </w:tc>
+        <w:tc>
+          <w:tcPr>
+            <w:tcW w:type="dxa" w:w="2400"/>
+            <w:tcBorders>
+              <w:top w:val="single" w:color="CCCCCC" w:sz="1"/>
+              <w:left w:val="single" w:color="CCCCCC" w:sz="1"/>
+              <w:bottom w:val="single" w:color="CCCCCC" w:sz="1"/>
+              <w:right w:val="single" w:color="CCCCCC" w:sz="1"/>
+            </w:tcBorders>
+            <w:tcMar>
+              <w:top w:type="dxa" w:w="60"/>
+              <w:left w:type="dxa" w:w="120"/>
+              <w:bottom w:type="dxa" w:w="60"/>
+              <w:right w:type="dxa" w:w="120"/>
+            </w:tcMar>
+          </w:tcPr>
+          <w:p>
+            <w:r>
+              <w:rPr>
+                <w:rFonts w:ascii="Courier New" w:cs="Courier New" w:eastAsia="Courier New" w:hAnsi="Courier New"/>
+                <w:sz w:val="18"/>
+                <w:szCs w:val="18"/>
+              </w:rPr>
+              <w:t xml:space="preserve">PostalAddressShape</w:t>
+            </w:r>
+          </w:p>
+        </w:tc>
+      </w:tr>
+      <w:tr>
+        <w:tc>
+          <w:tcPr>
+            <w:tcW w:type="dxa" w:w="500"/>
+            <w:tcBorders>
+              <w:top w:val="single" w:color="CCCCCC" w:sz="1"/>
+              <w:left w:val="single" w:color="CCCCCC" w:sz="1"/>
+              <w:bottom w:val="single" w:color="CCCCCC" w:sz="1"/>
+              <w:right w:val="single" w:color="CCCCCC" w:sz="1"/>
+            </w:tcBorders>
+            <w:tcMar>
+              <w:top w:type="dxa" w:w="60"/>
+              <w:left w:type="dxa" w:w="120"/>
+              <w:bottom w:type="dxa" w:w="60"/>
+              <w:right w:type="dxa" w:w="120"/>
+            </w:tcMar>
+          </w:tcPr>
+          <w:p>
+            <w:r>
+              <w:rPr>
+                <w:sz w:val="18"/>
+                <w:szCs w:val="18"/>
+              </w:rPr>
+              <w:t xml:space="preserve">V8</w:t>
+            </w:r>
+          </w:p>
+        </w:tc>
+        <w:tc>
+          <w:tcPr>
+            <w:tcW w:type="dxa" w:w="1900"/>
+            <w:tcBorders>
+              <w:top w:val="single" w:color="CCCCCC" w:sz="1"/>
+              <w:left w:val="single" w:color="CCCCCC" w:sz="1"/>
+              <w:bottom w:val="single" w:color="CCCCCC" w:sz="1"/>
+              <w:right w:val="single" w:color="CCCCCC" w:sz="1"/>
+            </w:tcBorders>
+            <w:tcMar>
+              <w:top w:type="dxa" w:w="60"/>
+              <w:left w:type="dxa" w:w="120"/>
+              <w:bottom w:type="dxa" w:w="60"/>
+              <w:right w:type="dxa" w:w="120"/>
+            </w:tcMar>
+          </w:tcPr>
+          <w:p>
+            <w:r>
+              <w:rPr>
+                <w:rFonts w:ascii="Courier New" w:cs="Courier New" w:eastAsia="Courier New" w:hAnsi="Courier New"/>
+                <w:sz w:val="18"/>
+                <w:szCs w:val="18"/>
+              </w:rPr>
+              <w:t xml:space="preserve">blank node de io:Origin</w:t>
+            </w:r>
+          </w:p>
+        </w:tc>
+        <w:tc>
+          <w:tcPr>
+            <w:tcW w:type="dxa" w:w="2200"/>
+            <w:tcBorders>
+              <w:top w:val="single" w:color="CCCCCC" w:sz="1"/>
+              <w:left w:val="single" w:color="CCCCCC" w:sz="1"/>
+              <w:bottom w:val="single" w:color="CCCCCC" w:sz="1"/>
+              <w:right w:val="single" w:color="CCCCCC" w:sz="1"/>
+            </w:tcBorders>
+            <w:tcMar>
+              <w:top w:type="dxa" w:w="60"/>
+              <w:left w:type="dxa" w:w="120"/>
+              <w:bottom w:type="dxa" w:w="60"/>
+              <w:right w:type="dxa" w:w="120"/>
+            </w:tcMar>
+          </w:tcPr>
+          <w:p>
+            <w:r>
+              <w:rPr>
+                <w:sz w:val="18"/>
+                <w:szCs w:val="18"/>
+              </w:rPr>
+              <w:t xml:space="preserve">blank node + no es Scraper/AVE/Curation</w:t>
+            </w:r>
+          </w:p>
+        </w:tc>
+        <w:tc>
+          <w:tcPr>
+            <w:tcW w:type="dxa" w:w="2360"/>
+            <w:tcBorders>
+              <w:top w:val="single" w:color="CCCCCC" w:sz="1"/>
+              <w:left w:val="single" w:color="CCCCCC" w:sz="1"/>
+              <w:bottom w:val="single" w:color="CCCCCC" w:sz="1"/>
+              <w:right w:val="single" w:color="CCCCCC" w:sz="1"/>
+            </w:tcBorders>
+            <w:tcMar>
+              <w:top w:type="dxa" w:w="60"/>
+              <w:left w:type="dxa" w:w="120"/>
+              <w:bottom w:type="dxa" w:w="60"/>
+              <w:right w:type="dxa" w:w="120"/>
+            </w:tcMar>
+          </w:tcPr>
+          <w:p>
+            <w:r>
+              <w:rPr>
+                <w:sz w:val="18"/>
+                <w:szCs w:val="18"/>
+              </w:rPr>
+              <w:t xml:space="preserve">NodeKindConstraintComponent + OrConstraintComponent</w:t>
+            </w:r>
+          </w:p>
+        </w:tc>
+        <w:tc>
+          <w:tcPr>
+            <w:tcW w:type="dxa" w:w="2400"/>
+            <w:tcBorders>
+              <w:top w:val="single" w:color="CCCCCC" w:sz="1"/>
+              <w:left w:val="single" w:color="CCCCCC" w:sz="1"/>
+              <w:bottom w:val="single" w:color="CCCCCC" w:sz="1"/>
+              <w:right w:val="single" w:color="CCCCCC" w:sz="1"/>
+            </w:tcBorders>
+            <w:tcMar>
+              <w:top w:type="dxa" w:w="60"/>
+              <w:left w:type="dxa" w:w="120"/>
+              <w:bottom w:type="dxa" w:w="60"/>
+              <w:right w:type="dxa" w:w="120"/>
+            </w:tcMar>
+          </w:tcPr>
+          <w:p>
+            <w:r>
+              <w:rPr>
+                <w:rFonts w:ascii="Courier New" w:cs="Courier New" w:eastAsia="Courier New" w:hAnsi="Courier New"/>
+                <w:sz w:val="18"/>
+                <w:szCs w:val="18"/>
+              </w:rPr>
+              <w:t xml:space="preserve">OriginShape</w:t>
+            </w:r>
+          </w:p>
+        </w:tc>
+      </w:tr>
+    </w:tbl>
+    <w:p>
+      <w:r>
+        <w:t xml:space="preserve"/>
+      </w:r>
+    </w:p>
+    <w:p>
+      <w:pPr>
+        <w:pStyle w:val="Heading3"/>
+      </w:pPr>
+      <w:r>
+        <w:t xml:space="preserve">Conclusión</w:t>
+      </w:r>
+    </w:p>
+    <w:p>
+      <w:r>
+        <w:t xml:space="preserve">Las dos validaciones funcionan como se esperaba:</w:t>
+      </w:r>
+    </w:p>
+    <w:p>
+      <w:r>
+        <w:t xml:space="preserve">• El grafo válido es aceptado (Conforms: True).</w:t>
+      </w:r>
+    </w:p>
+    <w:p>
+      <w:r>
+        <w:t xml:space="preserve">• El grafo inválido es rechazado y SHACL identifica exactamente qué restricción se violó, en qué nodo y por qué.</w:t>
+      </w:r>
+    </w:p>
+    <w:p>
+      <w:r>
+        <w:t xml:space="preserve">• El uso de variedad de constraints (pattern, minExclusive, minCount, in, class, qualifiedMinCount, nodeKind, or) demuestra el alcance de SHACL para validar grafos de conocimiento.</w:t>
+      </w:r>
+    </w:p>
+    <w:p>
+      <w:r>
+        <w:t xml:space="preserve"/>
+      </w:r>
+    </w:p>
+    <w:p>
+      <w:pPr>
+        <w:pStyle w:val="Heading3"/>
+      </w:pPr>
+      <w:r>
+        <w:t xml:space="preserve">Próximo paso</w:t>
+      </w:r>
+    </w:p>
+    <w:p>
+      <w:r>
+        <w:t xml:space="preserve">• Repetir esta validación dentro de GraphDB (cargar shapes.ttl como SHACL shapes graph + importar los dos data.ttl) para tener los screenshots para el video.</w:t>
+      </w:r>
+    </w:p>
+    <w:p>
+      <w:r>
+        <w:t xml:space="preserve">• Armar el documento final con: integrantes, URL del video, tabla de restricciones con justificación (sale de los comentarios de shapes.ttl), y los screenshots.</w:t>
+      </w:r>
+    </w:p>
+    <w:p>
+      <w:r>
+        <w:t xml:space="preserve">• Grabar el video con los 4 integrantes.</w:t>
       </w:r>
     </w:p>
     <w:sectPr>

</xml_diff>